<commit_message>
Subida agenda y concurso
</commit_message>
<xml_diff>
--- a/Plantilla final.docx
+++ b/Plantilla final.docx
@@ -28,7 +28,7 @@
       <w:r>
         <w:rPr>
           <w:rStyle w:val="1270"/>
-          <w:rFonts w:ascii="Arial" w:hAnsi="Arial" w:eastAsia="Arial" w:cs="Arial"/>
+          <w:rFonts w:ascii="Arial" w:hAnsi="Arial" w:cs="Arial"/>
         </w:rPr>
       </w:r>
     </w:p>
@@ -58,7 +58,7 @@
       <w:r>
         <w:rPr>
           <w:rStyle w:val="1270"/>
-          <w:rFonts w:ascii="Arial" w:hAnsi="Arial" w:eastAsia="Arial" w:cs="Arial"/>
+          <w:rFonts w:ascii="Arial" w:hAnsi="Arial" w:cs="Arial"/>
         </w:rPr>
       </w:r>
     </w:p>
@@ -90,7 +90,7 @@
       <w:r>
         <w:rPr>
           <w:rStyle w:val="1270"/>
-          <w:rFonts w:ascii="Arial" w:hAnsi="Arial" w:eastAsia="Arial" w:cs="Arial"/>
+          <w:rFonts w:ascii="Arial" w:hAnsi="Arial" w:cs="Arial"/>
           <w:highlight w:val="none"/>
         </w:rPr>
       </w:r>
@@ -194,7 +194,7 @@
       <w:r>
         <w:rPr>
           <w:rStyle w:val="1270"/>
-          <w:rFonts w:ascii="Arial" w:hAnsi="Arial" w:eastAsia="Arial" w:cs="Arial"/>
+          <w:rFonts w:ascii="Arial" w:hAnsi="Arial" w:cs="Arial"/>
         </w:rPr>
       </w:r>
     </w:p>
@@ -206,28 +206,107 @@
         <w:jc w:val="center"/>
         <w:rPr>
           <w:rStyle w:val="1270"/>
+          <w:rFonts w:ascii="Arial" w:hAnsi="Arial" w:eastAsia="Arial" w:cs="Arial"/>
+          <w:highlight w:val="none"/>
+          <w:lang w:val="en-US"/>
+        </w:rPr>
+      </w:pPr>
+      <w:r>
+        <w:rPr>
+          <w:rStyle w:val="1270"/>
+          <w:rFonts w:ascii="Arial" w:hAnsi="Arial" w:eastAsia="Arial" w:cs="Arial"/>
+          <w:lang w:val="es-ES"/>
+        </w:rPr>
+        <w:t xml:space="preserve">NetZero</w:t>
+      </w:r>
+      <w:r>
+        <w:rPr>
+          <w:rStyle w:val="1270"/>
+          <w:rFonts w:ascii="Arial" w:hAnsi="Arial" w:eastAsia="Arial" w:cs="Arial"/>
+          <w:lang w:val="en-US"/>
+        </w:rPr>
+      </w:r>
+      <w:r>
+        <w:rPr>
+          <w:rStyle w:val="1270"/>
           <w:rFonts w:ascii="Arial" w:hAnsi="Arial" w:cs="Arial"/>
         </w:rPr>
-      </w:pPr>
-      <w:r>
+      </w:r>
+    </w:p>
+    <w:p>
+      <w:pPr>
+        <w:pBdr/>
+        <w:spacing/>
+        <w:ind/>
+        <w:jc w:val="center"/>
         <w:rPr>
           <w:rStyle w:val="1270"/>
-          <w:rFonts w:ascii="Arial" w:hAnsi="Arial" w:eastAsia="Arial" w:cs="Arial"/>
-          <w:lang w:val="es-ES"/>
-        </w:rPr>
-        <w:t xml:space="preserve">NetZero</w:t>
-      </w:r>
+          <w:rFonts w:ascii="Arial" w:hAnsi="Arial" w:cs="Arial"/>
+          <w:sz w:val="36"/>
+          <w:szCs w:val="14"/>
+        </w:rPr>
+      </w:pPr>
       <w:r>
         <w:rPr>
           <w:rStyle w:val="1270"/>
           <w:rFonts w:ascii="Arial" w:hAnsi="Arial" w:eastAsia="Arial" w:cs="Arial"/>
+          <w:sz w:val="36"/>
+          <w:szCs w:val="14"/>
+          <w:highlight w:val="none"/>
           <w:lang w:val="en-US"/>
         </w:rPr>
       </w:r>
+      <w:hyperlink r:id="rId18" w:tooltip="https://ecodigithon.github.io/NetZero/" w:history="1">
+        <w:r>
+          <w:rPr>
+            <w:rStyle w:val="1292"/>
+            <w:rFonts w:ascii="Arial" w:hAnsi="Arial" w:eastAsia="Arial" w:cs="Arial"/>
+            <w:sz w:val="36"/>
+            <w:szCs w:val="14"/>
+            <w:highlight w:val="none"/>
+            <w:lang w:val="en-US"/>
+          </w:rPr>
+        </w:r>
+        <w:r>
+          <w:rPr>
+            <w:rStyle w:val="1292"/>
+            <w:rFonts w:ascii="Arial" w:hAnsi="Arial" w:eastAsia="Arial" w:cs="Arial"/>
+            <w:sz w:val="36"/>
+            <w:szCs w:val="14"/>
+            <w:highlight w:val="none"/>
+            <w:lang w:val="en-US"/>
+          </w:rPr>
+          <w:t xml:space="preserve">https://ecodigithon.github.io/NetZero</w:t>
+        </w:r>
+        <w:r>
+          <w:rPr>
+            <w:rStyle w:val="1292"/>
+            <w:rFonts w:ascii="Arial" w:hAnsi="Arial" w:eastAsia="Arial" w:cs="Arial"/>
+            <w:sz w:val="36"/>
+            <w:szCs w:val="14"/>
+            <w:highlight w:val="none"/>
+            <w:lang w:val="en-US"/>
+          </w:rPr>
+        </w:r>
+        <w:r>
+          <w:rPr>
+            <w:rStyle w:val="1292"/>
+            <w:rFonts w:ascii="Arial" w:hAnsi="Arial" w:eastAsia="Arial" w:cs="Arial"/>
+            <w:sz w:val="36"/>
+            <w:szCs w:val="14"/>
+            <w:highlight w:val="none"/>
+            <w:lang w:val="en-US"/>
+          </w:rPr>
+        </w:r>
+      </w:hyperlink>
+      <w:r/>
       <w:r>
         <w:rPr>
           <w:rStyle w:val="1270"/>
           <w:rFonts w:ascii="Arial" w:hAnsi="Arial" w:eastAsia="Arial" w:cs="Arial"/>
+          <w:sz w:val="36"/>
+          <w:szCs w:val="14"/>
+          <w:highlight w:val="none"/>
           <w:lang w:val="en-US"/>
         </w:rPr>
       </w:r>
@@ -275,10 +354,10 @@
                         <pic:nvPr/>
                       </pic:nvPicPr>
                       <pic:blipFill rotWithShape="1">
-                        <a:blip r:embed="rId18">
+                        <a:blip r:embed="rId19">
                           <a:extLst>
                             <a:ext uri="{96DAC541-7B7A-43D3-8B79-37D633B846F1}">
-                              <asvg:svgBlip xmlns:asvg="http://schemas.microsoft.com/office/drawing/2016/SVG/main" r:embed="rId19"/>
+                              <asvg:svgBlip xmlns:asvg="http://schemas.microsoft.com/office/drawing/2016/SVG/main" r:embed="rId20"/>
                             </a:ext>
                           </a:extLst>
                         </a:blip>
@@ -327,7 +406,7 @@
                 <o:lock v:ext="edit" aspectratio="t"/>
               </v:shapetype>
               <v:shape id="_x0000_i18" o:spid="_x0000_s18" type="#_x0000_t75" style="position:absolute;z-index:251658240;o:allowoverlap:true;o:allowincell:true;mso-position-horizontal-relative:margin;margin-left:41.75pt;mso-position-horizontal:absolute;mso-position-vertical-relative:text;margin-top:15.69pt;mso-position-vertical:absolute;width:398.26pt;height:11.12pt;mso-wrap-distance-left:9.00pt;mso-wrap-distance-top:0.00pt;mso-wrap-distance-right:9.00pt;mso-wrap-distance-bottom:0.00pt;z-index:1;" stroked="false">
-                <v:imagedata r:id="rId18" o:title=""/>
+                <v:imagedata r:id="rId19" o:title=""/>
                 <o:lock v:ext="edit" rotation="t"/>
               </v:shape>
             </w:pict>
@@ -342,8 +421,7 @@
       </w:r>
       <w:r>
         <w:rPr>
-          <w:rFonts w:ascii="Arial" w:hAnsi="Arial" w:eastAsia="Arial" w:cs="Arial"/>
-          <w:lang w:val="en-US"/>
+          <w:rFonts w:ascii="Arial" w:hAnsi="Arial" w:cs="Arial"/>
         </w:rPr>
       </w:r>
     </w:p>
@@ -379,8 +457,33 @@
           <w:bCs/>
           <w:sz w:val="28"/>
           <w:szCs w:val="28"/>
-        </w:rPr>
-      </w:r>
+          <w:lang w:val="en-US"/>
+        </w:rPr>
+      </w:r>
+      <w:r>
+        <w:rPr>
+          <w:rFonts w:ascii="Arial" w:hAnsi="Arial" w:cs="Arial"/>
+          <w:b/>
+          <w:bCs/>
+          <w:sz w:val="28"/>
+          <w:szCs w:val="28"/>
+        </w:rPr>
+      </w:r>
+    </w:p>
+    <w:p>
+      <w:pPr>
+        <w:pBdr/>
+        <w:spacing/>
+        <w:ind/>
+        <w:jc w:val="center"/>
+        <w:rPr>
+          <w:rFonts w:ascii="Arial" w:hAnsi="Arial" w:cs="Arial"/>
+          <w:b/>
+          <w:bCs/>
+          <w:sz w:val="28"/>
+          <w:szCs w:val="28"/>
+        </w:rPr>
+      </w:pPr>
       <w:r>
         <w:rPr>
           <w:rFonts w:ascii="Arial" w:hAnsi="Arial" w:eastAsia="Arial" w:cs="Arial"/>
@@ -390,14 +493,19 @@
           <w:szCs w:val="28"/>
           <w:lang w:val="en-US"/>
         </w:rPr>
-      </w:r>
-    </w:p>
-    <w:p>
-      <w:pPr>
-        <w:pBdr/>
-        <w:spacing/>
-        <w:ind/>
-        <w:jc w:val="center"/>
+        <w:t xml:space="preserve">Iván Jimenez</w:t>
+      </w:r>
+      <w:r>
+        <w:rPr>
+          <w:rFonts w:ascii="Arial" w:hAnsi="Arial" w:eastAsia="Arial" w:cs="Arial"/>
+          <w:b/>
+          <w:bCs/>
+          <w:sz w:val="28"/>
+          <w:szCs w:val="28"/>
+          <w:lang w:val="en-US"/>
+        </w:rPr>
+      </w:r>
+      <w:r>
         <w:rPr>
           <w:rFonts w:ascii="Arial" w:hAnsi="Arial" w:cs="Arial"/>
           <w:b/>
@@ -405,6 +513,21 @@
           <w:sz w:val="28"/>
           <w:szCs w:val="28"/>
         </w:rPr>
+      </w:r>
+    </w:p>
+    <w:p>
+      <w:pPr>
+        <w:pBdr/>
+        <w:spacing/>
+        <w:ind/>
+        <w:jc w:val="center"/>
+        <w:rPr>
+          <w:rFonts w:ascii="Arial" w:hAnsi="Arial" w:cs="Arial"/>
+          <w:b/>
+          <w:bCs/>
+          <w:sz w:val="28"/>
+          <w:szCs w:val="28"/>
+        </w:rPr>
       </w:pPr>
       <w:r>
         <w:rPr>
@@ -415,16 +538,7 @@
           <w:szCs w:val="28"/>
           <w:lang w:val="en-US"/>
         </w:rPr>
-        <w:t xml:space="preserve">Iván Jimenez</w:t>
-      </w:r>
-      <w:r>
-        <w:rPr>
-          <w:rFonts w:ascii="Arial" w:hAnsi="Arial" w:eastAsia="Arial" w:cs="Arial"/>
-          <w:b/>
-          <w:bCs/>
-          <w:sz w:val="28"/>
-          <w:szCs w:val="28"/>
-        </w:rPr>
+        <w:t xml:space="preserve">Diego Rojo</w:t>
       </w:r>
       <w:r>
         <w:rPr>
@@ -436,13 +550,7 @@
           <w:lang w:val="en-US"/>
         </w:rPr>
       </w:r>
-    </w:p>
-    <w:p>
-      <w:pPr>
-        <w:pBdr/>
-        <w:spacing/>
-        <w:ind/>
-        <w:jc w:val="center"/>
+      <w:r>
         <w:rPr>
           <w:rFonts w:ascii="Arial" w:hAnsi="Arial" w:cs="Arial"/>
           <w:b/>
@@ -450,6 +558,21 @@
           <w:sz w:val="28"/>
           <w:szCs w:val="28"/>
         </w:rPr>
+      </w:r>
+    </w:p>
+    <w:p>
+      <w:pPr>
+        <w:pBdr/>
+        <w:spacing/>
+        <w:ind/>
+        <w:jc w:val="center"/>
+        <w:rPr>
+          <w:rFonts w:ascii="Arial" w:hAnsi="Arial" w:cs="Arial"/>
+          <w:b/>
+          <w:bCs/>
+          <w:sz w:val="28"/>
+          <w:szCs w:val="28"/>
+        </w:rPr>
       </w:pPr>
       <w:r>
         <w:rPr>
@@ -460,7 +583,7 @@
           <w:szCs w:val="28"/>
           <w:lang w:val="en-US"/>
         </w:rPr>
-        <w:t xml:space="preserve">Diego Rojo</w:t>
+        <w:t xml:space="preserve">Aitor de Santos</w:t>
       </w:r>
       <w:r>
         <w:rPr>
@@ -473,43 +596,7 @@
       </w:r>
       <w:r>
         <w:rPr>
-          <w:rFonts w:ascii="Arial" w:hAnsi="Arial" w:eastAsia="Arial" w:cs="Arial"/>
-          <w:b/>
-          <w:bCs/>
-          <w:sz w:val="28"/>
-          <w:szCs w:val="28"/>
-          <w:lang w:val="en-US"/>
-        </w:rPr>
-      </w:r>
-    </w:p>
-    <w:p>
-      <w:pPr>
-        <w:pBdr/>
-        <w:spacing/>
-        <w:ind/>
-        <w:jc w:val="center"/>
-        <w:rPr>
           <w:rFonts w:ascii="Arial" w:hAnsi="Arial" w:cs="Arial"/>
-          <w:b/>
-          <w:bCs/>
-          <w:sz w:val="28"/>
-          <w:szCs w:val="28"/>
-        </w:rPr>
-      </w:pPr>
-      <w:r>
-        <w:rPr>
-          <w:rFonts w:ascii="Arial" w:hAnsi="Arial" w:eastAsia="Arial" w:cs="Arial"/>
-          <w:b/>
-          <w:bCs/>
-          <w:sz w:val="28"/>
-          <w:szCs w:val="28"/>
-          <w:lang w:val="en-US"/>
-        </w:rPr>
-        <w:t xml:space="preserve">Aitor de Santos</w:t>
-      </w:r>
-      <w:r>
-        <w:rPr>
-          <w:rFonts w:ascii="Arial" w:hAnsi="Arial" w:eastAsia="Arial" w:cs="Arial"/>
           <w:b/>
           <w:bCs/>
           <w:sz w:val="28"/>
@@ -566,7 +653,7 @@
                         <pic:nvPr/>
                       </pic:nvPicPr>
                       <pic:blipFill rotWithShape="1">
-                        <a:blip r:embed="rId20"/>
+                        <a:blip r:embed="rId21"/>
                         <a:stretch/>
                       </pic:blipFill>
                       <pic:spPr bwMode="auto">
@@ -606,7 +693,7 @@
                 <o:lock v:ext="edit" aspectratio="t"/>
               </v:shapetype>
               <v:shape id="_x0000_i19" o:spid="_x0000_s19" type="#_x0000_t75" style="position:absolute;z-index:251691008;o:allowoverlap:true;o:allowincell:true;mso-position-horizontal-relative:text;margin-left:94.26pt;mso-position-horizontal:absolute;mso-position-vertical-relative:text;margin-top:133.29pt;mso-position-vertical:absolute;width:130.13pt;height:46.47pt;mso-wrap-distance-left:9.07pt;mso-wrap-distance-top:0.00pt;mso-wrap-distance-right:9.07pt;mso-wrap-distance-bottom:0.00pt;rotation:0;z-index:1;" stroked="false">
-                <v:imagedata r:id="rId20" o:title=""/>
+                <v:imagedata r:id="rId21" o:title=""/>
                 <o:lock v:ext="edit" rotation="t"/>
               </v:shape>
             </w:pict>
@@ -654,7 +741,7 @@
                         <pic:nvPr/>
                       </pic:nvPicPr>
                       <pic:blipFill rotWithShape="1">
-                        <a:blip r:embed="rId21"/>
+                        <a:blip r:embed="rId22"/>
                         <a:stretch/>
                       </pic:blipFill>
                       <pic:spPr bwMode="auto">
@@ -694,7 +781,7 @@
                 <o:lock v:ext="edit" aspectratio="t"/>
               </v:shapetype>
               <v:shape id="_x0000_i20" o:spid="_x0000_s20" type="#_x0000_t75" style="position:absolute;z-index:251695104;o:allowoverlap:true;o:allowincell:true;mso-position-horizontal-relative:text;margin-left:-7.37pt;mso-position-horizontal:absolute;mso-position-vertical-relative:text;margin-top:72.52pt;mso-position-vertical:absolute;width:90.75pt;height:107.25pt;mso-wrap-distance-left:9.07pt;mso-wrap-distance-top:0.00pt;mso-wrap-distance-right:9.07pt;mso-wrap-distance-bottom:0.00pt;rotation:0;z-index:1;" stroked="false">
-                <v:imagedata r:id="rId21" o:title=""/>
+                <v:imagedata r:id="rId22" o:title=""/>
                 <o:lock v:ext="edit" rotation="t"/>
               </v:shape>
             </w:pict>
@@ -742,7 +829,7 @@
                         <pic:nvPr/>
                       </pic:nvPicPr>
                       <pic:blipFill rotWithShape="1">
-                        <a:blip r:embed="rId22"/>
+                        <a:blip r:embed="rId23"/>
                         <a:stretch/>
                       </pic:blipFill>
                       <pic:spPr bwMode="auto">
@@ -782,7 +869,7 @@
                 <o:lock v:ext="edit" aspectratio="t"/>
               </v:shapetype>
               <v:shape id="_x0000_i21" o:spid="_x0000_s21" type="#_x0000_t75" style="position:absolute;z-index:251697152;o:allowoverlap:true;o:allowincell:true;mso-position-horizontal-relative:text;margin-left:258.20pt;mso-position-horizontal:absolute;mso-position-vertical-relative:text;margin-top:144.53pt;mso-position-vertical:absolute;width:232.41pt;height:31.50pt;mso-wrap-distance-left:9.07pt;mso-wrap-distance-top:0.00pt;mso-wrap-distance-right:9.07pt;mso-wrap-distance-bottom:0.00pt;rotation:0;z-index:1;" stroked="false">
-                <v:imagedata r:id="rId22" o:title=""/>
+                <v:imagedata r:id="rId23" o:title=""/>
                 <o:lock v:ext="edit" rotation="t"/>
               </v:shape>
             </w:pict>
@@ -811,8 +898,7 @@
       </w:r>
       <w:r>
         <w:rPr>
-          <w:rFonts w:ascii="Arial" w:hAnsi="Arial" w:eastAsia="Arial" w:cs="Arial"/>
-          <w:lang w:val="en-US"/>
+          <w:rFonts w:ascii="Arial" w:hAnsi="Arial" w:cs="Arial"/>
         </w:rPr>
       </w:r>
     </w:p>
@@ -843,6 +929,11 @@
           <w:rFonts w:ascii="Arial" w:hAnsi="Arial" w:eastAsia="Arial" w:cs="Arial"/>
         </w:rPr>
       </w:r>
+      <w:r>
+        <w:rPr>
+          <w:rFonts w:ascii="Arial" w:hAnsi="Arial" w:cs="Arial"/>
+        </w:rPr>
+      </w:r>
     </w:p>
     <w:p>
       <w:pPr>
@@ -862,6 +953,11 @@
       <w:r>
         <w:rPr>
           <w:rFonts w:ascii="Arial" w:hAnsi="Arial" w:eastAsia="Arial" w:cs="Arial"/>
+        </w:rPr>
+      </w:r>
+      <w:r>
+        <w:rPr>
+          <w:rFonts w:ascii="Arial" w:hAnsi="Arial" w:cs="Arial"/>
         </w:rPr>
       </w:r>
     </w:p>
@@ -903,7 +999,7 @@
       </w:r>
       <w:r>
         <w:rPr>
-          <w:rFonts w:ascii="Arial" w:hAnsi="Arial" w:eastAsia="Arial" w:cs="Arial"/>
+          <w:rFonts w:ascii="Arial" w:hAnsi="Arial" w:cs="Arial"/>
           <w:u w:val="single"/>
         </w:rPr>
       </w:r>
@@ -1019,6 +1115,11 @@
           <w:rFonts w:ascii="Arial" w:hAnsi="Arial" w:eastAsia="Arial" w:cs="Arial"/>
         </w:rPr>
       </w:r>
+      <w:r>
+        <w:rPr>
+          <w:rFonts w:ascii="Arial" w:hAnsi="Arial" w:cs="Arial"/>
+        </w:rPr>
+      </w:r>
     </w:p>
     <w:p>
       <w:pPr>
@@ -1147,6 +1248,11 @@
       <w:r>
         <w:rPr>
           <w:rFonts w:ascii="Arial" w:hAnsi="Arial" w:eastAsia="Arial" w:cs="Arial"/>
+        </w:rPr>
+      </w:r>
+      <w:r>
+        <w:rPr>
+          <w:rFonts w:ascii="Arial" w:hAnsi="Arial" w:cs="Arial"/>
         </w:rPr>
       </w:r>
     </w:p>
@@ -1188,7 +1294,7 @@
       </w:r>
       <w:r>
         <w:rPr>
-          <w:rFonts w:ascii="Arial" w:hAnsi="Arial" w:eastAsia="Arial" w:cs="Arial"/>
+          <w:rFonts w:ascii="Arial" w:hAnsi="Arial" w:cs="Arial"/>
           <w:u w:val="single"/>
         </w:rPr>
       </w:r>
@@ -1440,6 +1546,11 @@
       <w:r>
         <w:rPr>
           <w:rFonts w:ascii="Arial" w:hAnsi="Arial" w:eastAsia="Arial" w:cs="Arial"/>
+        </w:rPr>
+      </w:r>
+      <w:r>
+        <w:rPr>
+          <w:rFonts w:ascii="Arial" w:hAnsi="Arial" w:cs="Arial"/>
         </w:rPr>
       </w:r>
     </w:p>
@@ -1488,7 +1599,7 @@
       </w:r>
       <w:r>
         <w:rPr>
-          <w:rFonts w:ascii="Arial" w:hAnsi="Arial" w:eastAsia="Arial" w:cs="Arial"/>
+          <w:rFonts w:ascii="Arial" w:hAnsi="Arial" w:cs="Arial"/>
           <w:u w:val="single"/>
         </w:rPr>
       </w:r>
@@ -1656,6 +1767,11 @@
           <w:rFonts w:ascii="Arial" w:hAnsi="Arial" w:eastAsia="Arial" w:cs="Arial"/>
         </w:rPr>
       </w:r>
+      <w:r>
+        <w:rPr>
+          <w:rFonts w:ascii="Arial" w:hAnsi="Arial" w:cs="Arial"/>
+        </w:rPr>
+      </w:r>
     </w:p>
     <w:p>
       <w:pPr>
@@ -1677,6 +1793,11 @@
           <w:rFonts w:ascii="Arial" w:hAnsi="Arial" w:eastAsia="Arial" w:cs="Arial"/>
         </w:rPr>
       </w:r>
+      <w:r>
+        <w:rPr>
+          <w:rFonts w:ascii="Arial" w:hAnsi="Arial" w:cs="Arial"/>
+        </w:rPr>
+      </w:r>
     </w:p>
     <w:p>
       <w:pPr>
@@ -1831,6 +1952,11 @@
       <w:r>
         <w:rPr>
           <w:rFonts w:ascii="Arial" w:hAnsi="Arial" w:eastAsia="Arial" w:cs="Arial"/>
+        </w:rPr>
+      </w:r>
+      <w:r>
+        <w:rPr>
+          <w:rFonts w:ascii="Arial" w:hAnsi="Arial" w:cs="Arial"/>
         </w:rPr>
       </w:r>
     </w:p>
@@ -1862,39 +1988,31 @@
       </w:r>
       <w:r>
         <w:rPr>
-          <w:rFonts w:ascii="Arial" w:hAnsi="Arial" w:eastAsia="Arial" w:cs="Arial"/>
-          <w:b/>
-          <w:bCs/>
-        </w:rPr>
-      </w:r>
-    </w:p>
-    <w:p>
-      <w:pPr>
-        <w:pBdr/>
-        <w:spacing/>
-        <w:ind/>
-        <w:jc w:val="both"/>
-        <w:rPr>
           <w:rFonts w:ascii="Arial" w:hAnsi="Arial" w:cs="Arial"/>
           <w:b/>
           <w:bCs/>
         </w:rPr>
-      </w:pPr>
-      <w:r>
-        <w:rPr>
-          <w:rFonts w:ascii="Arial" w:hAnsi="Arial" w:eastAsia="Arial" w:cs="Arial"/>
+      </w:r>
+    </w:p>
+    <w:p>
+      <w:pPr>
+        <w:pBdr/>
+        <w:spacing/>
+        <w:ind/>
+        <w:jc w:val="both"/>
+        <w:rPr>
+          <w:rFonts w:ascii="Arial" w:hAnsi="Arial" w:cs="Arial"/>
           <w:b/>
           <w:bCs/>
         </w:rPr>
-        <w:t xml:space="preserve">Ventajas</w:t>
-      </w:r>
+      </w:pPr>
       <w:r>
         <w:rPr>
           <w:rFonts w:ascii="Arial" w:hAnsi="Arial" w:eastAsia="Arial" w:cs="Arial"/>
           <w:b/>
           <w:bCs/>
         </w:rPr>
-        <w:t xml:space="preserve">:</w:t>
+        <w:t xml:space="preserve">Ventajas</w:t>
       </w:r>
       <w:r>
         <w:rPr>
@@ -1902,6 +2020,7 @@
           <w:b/>
           <w:bCs/>
         </w:rPr>
+        <w:t xml:space="preserve">:</w:t>
       </w:r>
       <w:r>
         <w:rPr>
@@ -1910,6 +2029,13 @@
           <w:bCs/>
         </w:rPr>
       </w:r>
+      <w:r>
+        <w:rPr>
+          <w:rFonts w:ascii="Arial" w:hAnsi="Arial" w:cs="Arial"/>
+          <w:b/>
+          <w:bCs/>
+        </w:rPr>
+      </w:r>
     </w:p>
     <w:p>
       <w:pPr>
@@ -1942,6 +2068,11 @@
       <w:r>
         <w:rPr>
           <w:rFonts w:ascii="Arial" w:hAnsi="Arial" w:eastAsia="Arial" w:cs="Arial"/>
+        </w:rPr>
+      </w:r>
+      <w:r>
+        <w:rPr>
+          <w:rFonts w:ascii="Arial" w:hAnsi="Arial" w:cs="Arial"/>
         </w:rPr>
       </w:r>
     </w:p>
@@ -2043,6 +2174,11 @@
           <w:rFonts w:ascii="Arial" w:hAnsi="Arial" w:eastAsia="Arial" w:cs="Arial"/>
         </w:rPr>
       </w:r>
+      <w:r>
+        <w:rPr>
+          <w:rFonts w:ascii="Arial" w:hAnsi="Arial" w:cs="Arial"/>
+        </w:rPr>
+      </w:r>
     </w:p>
     <w:p>
       <w:pPr>
@@ -2112,6 +2248,11 @@
           <w:rFonts w:ascii="Arial" w:hAnsi="Arial" w:eastAsia="Arial" w:cs="Arial"/>
         </w:rPr>
       </w:r>
+      <w:r>
+        <w:rPr>
+          <w:rFonts w:ascii="Arial" w:hAnsi="Arial" w:cs="Arial"/>
+        </w:rPr>
+      </w:r>
     </w:p>
     <w:p>
       <w:pPr>
@@ -2181,6 +2322,11 @@
           <w:rFonts w:ascii="Arial" w:hAnsi="Arial" w:eastAsia="Arial" w:cs="Arial"/>
         </w:rPr>
       </w:r>
+      <w:r>
+        <w:rPr>
+          <w:rFonts w:ascii="Arial" w:hAnsi="Arial" w:cs="Arial"/>
+        </w:rPr>
+      </w:r>
     </w:p>
     <w:p>
       <w:pPr>
@@ -2202,6 +2348,11 @@
           <w:rFonts w:ascii="Arial" w:hAnsi="Arial" w:eastAsia="Arial" w:cs="Arial"/>
         </w:rPr>
       </w:r>
+      <w:r>
+        <w:rPr>
+          <w:rFonts w:ascii="Arial" w:hAnsi="Arial" w:cs="Arial"/>
+        </w:rPr>
+      </w:r>
     </w:p>
     <w:p>
       <w:pPr>
@@ -2223,6 +2374,11 @@
           <w:rFonts w:ascii="Arial" w:hAnsi="Arial" w:eastAsia="Arial" w:cs="Arial"/>
         </w:rPr>
       </w:r>
+      <w:r>
+        <w:rPr>
+          <w:rFonts w:ascii="Arial" w:hAnsi="Arial" w:cs="Arial"/>
+        </w:rPr>
+      </w:r>
     </w:p>
     <w:p>
       <w:pPr>
@@ -2244,6 +2400,11 @@
           <w:rFonts w:ascii="Arial" w:hAnsi="Arial" w:eastAsia="Arial" w:cs="Arial"/>
         </w:rPr>
       </w:r>
+      <w:r>
+        <w:rPr>
+          <w:rFonts w:ascii="Arial" w:hAnsi="Arial" w:cs="Arial"/>
+        </w:rPr>
+      </w:r>
     </w:p>
     <w:p>
       <w:pPr>
@@ -2265,6 +2426,11 @@
           <w:rFonts w:ascii="Arial" w:hAnsi="Arial" w:eastAsia="Arial" w:cs="Arial"/>
         </w:rPr>
       </w:r>
+      <w:r>
+        <w:rPr>
+          <w:rFonts w:ascii="Arial" w:hAnsi="Arial" w:cs="Arial"/>
+        </w:rPr>
+      </w:r>
     </w:p>
     <w:p>
       <w:pPr>
@@ -2288,6 +2454,11 @@
           <w:rFonts w:ascii="Arial" w:hAnsi="Arial" w:eastAsia="Arial" w:cs="Arial"/>
         </w:rPr>
       </w:r>
+      <w:r>
+        <w:rPr>
+          <w:rFonts w:ascii="Arial" w:hAnsi="Arial" w:cs="Arial"/>
+        </w:rPr>
+      </w:r>
     </w:p>
     <w:p>
       <w:pPr>
@@ -2307,6 +2478,11 @@
       <w:r>
         <w:rPr>
           <w:rFonts w:ascii="Arial" w:hAnsi="Arial" w:eastAsia="Arial" w:cs="Arial"/>
+        </w:rPr>
+      </w:r>
+      <w:r>
+        <w:rPr>
+          <w:rFonts w:ascii="Arial" w:hAnsi="Arial" w:cs="Arial"/>
         </w:rPr>
       </w:r>
     </w:p>
@@ -2335,6 +2511,11 @@
           <w:rFonts w:ascii="Arial" w:hAnsi="Arial" w:eastAsia="Arial" w:cs="Arial"/>
         </w:rPr>
       </w:r>
+      <w:r>
+        <w:rPr>
+          <w:rFonts w:ascii="Arial" w:hAnsi="Arial" w:cs="Arial"/>
+        </w:rPr>
+      </w:r>
     </w:p>
     <w:p>
       <w:pPr>
@@ -2354,6 +2535,11 @@
       <w:r>
         <w:rPr>
           <w:rFonts w:ascii="Arial" w:hAnsi="Arial" w:eastAsia="Arial" w:cs="Arial"/>
+        </w:rPr>
+      </w:r>
+      <w:r>
+        <w:rPr>
+          <w:rFonts w:ascii="Arial" w:hAnsi="Arial" w:cs="Arial"/>
         </w:rPr>
       </w:r>
     </w:p>
@@ -2394,8 +2580,7 @@
       </w:r>
       <w:r>
         <w:rPr>
-          <w:rFonts w:ascii="Arial" w:hAnsi="Arial" w:eastAsia="Arial" w:cs="Arial"/>
-          <w:lang w:val="es-ES"/>
+          <w:rFonts w:ascii="Arial" w:hAnsi="Arial" w:cs="Arial"/>
         </w:rPr>
       </w:r>
     </w:p>
@@ -2406,7 +2591,9 @@
         <w:ind w:firstLine="0" w:left="720"/>
         <w:jc w:val="center"/>
         <w:rPr>
-          <w:rFonts w:ascii="Arial" w:hAnsi="Arial" w:cs="Arial"/>
+          <w:rFonts w:ascii="Arial" w:hAnsi="Arial" w:eastAsia="Arial" w:cs="Arial"/>
+          <w:highlight w:val="none"/>
+          <w:lang w:val="es-ES"/>
         </w:rPr>
       </w:pPr>
       <w:r>
@@ -2441,7 +2628,7 @@
                         <pic:nvPr/>
                       </pic:nvPicPr>
                       <pic:blipFill rotWithShape="1">
-                        <a:blip r:embed="rId23"/>
+                        <a:blip r:embed="rId24"/>
                         <a:stretch/>
                       </pic:blipFill>
                       <pic:spPr bwMode="auto">
@@ -2481,7 +2668,7 @@
                 <o:lock v:ext="edit" aspectratio="t"/>
               </v:shapetype>
               <v:shape id="_x0000_i22" o:spid="_x0000_s22" type="#_x0000_t75" style="width:91.13pt;height:92.13pt;mso-wrap-distance-left:0.00pt;mso-wrap-distance-top:0.00pt;mso-wrap-distance-right:0.00pt;mso-wrap-distance-bottom:0.00pt;rotation:0;z-index:1;" stroked="false">
-                <v:imagedata r:id="rId23" o:title=""/>
+                <v:imagedata r:id="rId24" o:title=""/>
                 <o:lock v:ext="edit" rotation="t"/>
               </v:shape>
             </w:pict>
@@ -2496,8 +2683,132 @@
       </w:r>
       <w:r>
         <w:rPr>
-          <w:rFonts w:ascii="Arial" w:hAnsi="Arial" w:eastAsia="Arial" w:cs="Arial"/>
+          <w:rFonts w:ascii="Arial" w:hAnsi="Arial" w:cs="Arial"/>
+        </w:rPr>
+      </w:r>
+    </w:p>
+    <w:p>
+      <w:pPr>
+        <w:pBdr/>
+        <w:spacing/>
+        <w:ind w:firstLine="0" w:left="720"/>
+        <w:jc w:val="center"/>
+        <w:rPr>
+          <w:highlight w:val="none"/>
+        </w:rPr>
+      </w:pPr>
+      <w:r>
+        <w:rPr>
+          <w:rFonts w:ascii="Arial" w:hAnsi="Arial" w:eastAsia="Arial" w:cs="Arial"/>
+          <w:highlight w:val="none"/>
           <w:lang w:val="es-ES"/>
+        </w:rPr>
+        <w:t xml:space="preserve">Enlace: </w:t>
+      </w:r>
+      <w:hyperlink r:id="rId25" w:tooltip="https://ecodigithon.github.io/NetZero/" w:history="1">
+        <w:r>
+          <w:rPr>
+            <w:rStyle w:val="1292"/>
+            <w:rFonts w:ascii="Arial" w:hAnsi="Arial" w:eastAsia="Arial" w:cs="Arial"/>
+            <w:highlight w:val="none"/>
+            <w:lang w:val="es-ES"/>
+          </w:rPr>
+        </w:r>
+        <w:r>
+          <w:rPr>
+            <w:rStyle w:val="1292"/>
+            <w:rFonts w:ascii="Arial" w:hAnsi="Arial" w:eastAsia="Arial" w:cs="Arial"/>
+            <w:highlight w:val="none"/>
+            <w:lang w:val="es-ES"/>
+          </w:rPr>
+          <w:t xml:space="preserve">https://ecodigithon.github.io/NetZero/</w:t>
+        </w:r>
+        <w:r>
+          <w:rPr>
+            <w:rStyle w:val="1292"/>
+            <w:rFonts w:ascii="Arial" w:hAnsi="Arial" w:eastAsia="Arial" w:cs="Arial"/>
+            <w:highlight w:val="none"/>
+            <w:lang w:val="es-ES"/>
+          </w:rPr>
+        </w:r>
+        <w:r>
+          <w:rPr>
+            <w:rStyle w:val="1292"/>
+            <w:rFonts w:ascii="Arial" w:hAnsi="Arial" w:eastAsia="Arial" w:cs="Arial"/>
+            <w:highlight w:val="none"/>
+            <w:lang w:val="es-ES"/>
+          </w:rPr>
+        </w:r>
+        <w:r>
+          <w:rPr>
+            <w:rStyle w:val="1292"/>
+            <w:rFonts w:ascii="Arial" w:hAnsi="Arial" w:eastAsia="Arial" w:cs="Arial"/>
+            <w:highlight w:val="none"/>
+            <w:lang w:val="es-ES"/>
+          </w:rPr>
+        </w:r>
+      </w:hyperlink>
+      <w:r/>
+      <w:r>
+        <w:rPr>
+          <w:rFonts w:ascii="Arial" w:hAnsi="Arial" w:cs="Arial"/>
+        </w:rPr>
+      </w:r>
+    </w:p>
+    <w:p>
+      <w:pPr>
+        <w:pBdr/>
+        <w:spacing/>
+        <w:ind w:firstLine="0" w:left="720"/>
+        <w:jc w:val="center"/>
+        <w:rPr>
+          <w:rFonts w:ascii="Arial" w:hAnsi="Arial" w:cs="Arial"/>
+        </w:rPr>
+      </w:pPr>
+      <w:r>
+        <w:rPr>
+          <w:highlight w:val="none"/>
+          <w:lang w:val="es-ES"/>
+        </w:rPr>
+        <w:t xml:space="preserve">Repositorio: </w:t>
+      </w:r>
+      <w:r>
+        <w:rPr>
+          <w:highlight w:val="none"/>
+          <w:lang w:val="es-ES"/>
+        </w:rPr>
+      </w:r>
+      <w:hyperlink r:id="rId26" w:tooltip="https://github.com/Ecodigithon/NetZero" w:history="1">
+        <w:r>
+          <w:rPr>
+            <w:rStyle w:val="1292"/>
+            <w:highlight w:val="none"/>
+            <w:lang w:val="es-ES"/>
+          </w:rPr>
+          <w:t xml:space="preserve">https://github.com/Ecodigithon/NetZero</w:t>
+        </w:r>
+        <w:r>
+          <w:rPr>
+            <w:rStyle w:val="1292"/>
+            <w:highlight w:val="none"/>
+            <w:lang w:val="es-ES"/>
+          </w:rPr>
+        </w:r>
+        <w:r>
+          <w:rPr>
+            <w:rStyle w:val="1292"/>
+            <w:highlight w:val="none"/>
+          </w:rPr>
+        </w:r>
+      </w:hyperlink>
+      <w:r>
+        <w:rPr>
+          <w:highlight w:val="none"/>
+        </w:rPr>
+      </w:r>
+      <w:r>
+        <w:rPr>
+          <w:highlight w:val="none"/>
         </w:rPr>
       </w:r>
     </w:p>
@@ -2530,7 +2841,7 @@
       </w:r>
       <w:r>
         <w:rPr>
-          <w:rFonts w:ascii="Arial" w:hAnsi="Arial" w:eastAsia="Arial" w:cs="Arial"/>
+          <w:rFonts w:ascii="Arial" w:hAnsi="Arial" w:cs="Arial"/>
           <w:b/>
           <w:bCs/>
         </w:rPr>
@@ -2602,7 +2913,7 @@
       </w:r>
       <w:r>
         <w:rPr>
-          <w:rFonts w:ascii="Arial" w:hAnsi="Arial" w:eastAsia="Arial" w:cs="Arial"/>
+          <w:rFonts w:ascii="Arial" w:hAnsi="Arial" w:cs="Arial"/>
           <w:b/>
           <w:bCs/>
         </w:rPr>
@@ -2642,7 +2953,7 @@
       </w:r>
       <w:r>
         <w:rPr>
-          <w:rFonts w:ascii="Arial" w:hAnsi="Arial" w:eastAsia="Arial" w:cs="Arial"/>
+          <w:rFonts w:ascii="Arial" w:hAnsi="Arial" w:cs="Arial"/>
           <w:b/>
           <w:bCs/>
           <w:sz w:val="20"/>
@@ -2694,7 +3005,7 @@
       </w:r>
       <w:r>
         <w:rPr>
-          <w:rFonts w:ascii="Arial" w:hAnsi="Arial" w:eastAsia="Arial" w:cs="Arial"/>
+          <w:rFonts w:ascii="Arial" w:hAnsi="Arial" w:cs="Arial"/>
           <w:sz w:val="22"/>
           <w:szCs w:val="20"/>
         </w:rPr>
@@ -2787,7 +3098,7 @@
       </w:r>
       <w:r>
         <w:rPr>
-          <w:rFonts w:ascii="Arial" w:hAnsi="Arial" w:eastAsia="Arial" w:cs="Arial"/>
+          <w:rFonts w:ascii="Arial" w:hAnsi="Arial" w:cs="Arial"/>
           <w:sz w:val="22"/>
           <w:szCs w:val="20"/>
         </w:rPr>
@@ -2861,7 +3172,7 @@
       </w:r>
       <w:r>
         <w:rPr>
-          <w:rFonts w:ascii="Arial" w:hAnsi="Arial" w:eastAsia="Arial" w:cs="Arial"/>
+          <w:rFonts w:ascii="Arial" w:hAnsi="Arial" w:cs="Arial"/>
           <w:sz w:val="22"/>
           <w:szCs w:val="20"/>
         </w:rPr>
@@ -2946,7 +3257,7 @@
       </w:r>
       <w:r>
         <w:rPr>
-          <w:rFonts w:ascii="Arial" w:hAnsi="Arial" w:eastAsia="Arial" w:cs="Arial"/>
+          <w:rFonts w:ascii="Arial" w:hAnsi="Arial" w:cs="Arial"/>
           <w:sz w:val="22"/>
           <w:szCs w:val="20"/>
         </w:rPr>
@@ -3039,7 +3350,7 @@
       </w:r>
       <w:r>
         <w:rPr>
-          <w:rFonts w:ascii="Arial" w:hAnsi="Arial" w:eastAsia="Arial" w:cs="Arial"/>
+          <w:rFonts w:ascii="Arial" w:hAnsi="Arial" w:cs="Arial"/>
           <w:sz w:val="22"/>
           <w:szCs w:val="20"/>
         </w:rPr>
@@ -3074,7 +3385,7 @@
       </w:r>
       <w:r>
         <w:rPr>
-          <w:rFonts w:ascii="Arial" w:hAnsi="Arial" w:eastAsia="Arial" w:cs="Arial"/>
+          <w:rFonts w:ascii="Arial" w:hAnsi="Arial" w:cs="Arial"/>
           <w:b/>
           <w:bCs/>
         </w:rPr>
@@ -3130,7 +3441,7 @@
       </w:r>
       <w:r>
         <w:rPr>
-          <w:rFonts w:ascii="Arial" w:hAnsi="Arial" w:eastAsia="Arial" w:cs="Arial"/>
+          <w:rFonts w:ascii="Arial" w:hAnsi="Arial" w:cs="Arial"/>
           <w:b/>
           <w:bCs/>
         </w:rPr>
@@ -3180,7 +3491,7 @@
       </w:r>
       <w:r>
         <w:rPr>
-          <w:rFonts w:ascii="Arial" w:hAnsi="Arial" w:eastAsia="Arial" w:cs="Arial"/>
+          <w:rFonts w:ascii="Arial" w:hAnsi="Arial" w:cs="Arial"/>
           <w:sz w:val="22"/>
           <w:szCs w:val="20"/>
         </w:rPr>
@@ -3294,7 +3605,7 @@
       </w:r>
       <w:r>
         <w:rPr>
-          <w:rFonts w:ascii="Arial" w:hAnsi="Arial" w:eastAsia="Arial" w:cs="Arial"/>
+          <w:rFonts w:ascii="Arial" w:hAnsi="Arial" w:cs="Arial"/>
           <w:sz w:val="22"/>
           <w:szCs w:val="20"/>
         </w:rPr>
@@ -3349,7 +3660,7 @@
       </w:r>
       <w:r>
         <w:rPr>
-          <w:rFonts w:ascii="Arial" w:hAnsi="Arial" w:eastAsia="Arial" w:cs="Arial"/>
+          <w:rFonts w:ascii="Arial" w:hAnsi="Arial" w:cs="Arial"/>
           <w:sz w:val="22"/>
           <w:szCs w:val="20"/>
         </w:rPr>
@@ -3455,7 +3766,7 @@
       </w:r>
       <w:r>
         <w:rPr>
-          <w:rFonts w:ascii="Arial" w:hAnsi="Arial" w:eastAsia="Arial" w:cs="Arial"/>
+          <w:rFonts w:ascii="Arial" w:hAnsi="Arial" w:cs="Arial"/>
           <w:sz w:val="22"/>
           <w:szCs w:val="20"/>
         </w:rPr>
@@ -3489,7 +3800,7 @@
       </w:r>
       <w:r>
         <w:rPr>
-          <w:rFonts w:ascii="Arial" w:hAnsi="Arial" w:eastAsia="Arial" w:cs="Arial"/>
+          <w:rFonts w:ascii="Arial" w:hAnsi="Arial" w:cs="Arial"/>
           <w:sz w:val="32"/>
           <w:szCs w:val="32"/>
         </w:rPr>
@@ -3530,7 +3841,7 @@
       </w:r>
       <w:r>
         <w:rPr>
-          <w:rFonts w:ascii="Arial" w:hAnsi="Arial" w:eastAsia="Arial" w:cs="Arial"/>
+          <w:rFonts w:ascii="Arial" w:hAnsi="Arial" w:cs="Arial"/>
           <w:b/>
           <w:bCs/>
           <w:sz w:val="28"/>
@@ -3574,7 +3885,7 @@
       </w:r>
       <w:r>
         <w:rPr>
-          <w:rFonts w:ascii="Arial" w:hAnsi="Arial" w:eastAsia="Arial" w:cs="Arial"/>
+          <w:rFonts w:ascii="Arial" w:hAnsi="Arial" w:cs="Arial"/>
           <w:sz w:val="22"/>
           <w:szCs w:val="20"/>
         </w:rPr>
@@ -3614,7 +3925,7 @@
       </w:r>
       <w:r>
         <w:rPr>
-          <w:rFonts w:ascii="Arial" w:hAnsi="Arial" w:eastAsia="Arial" w:cs="Arial"/>
+          <w:rFonts w:ascii="Arial" w:hAnsi="Arial" w:cs="Arial"/>
           <w:sz w:val="22"/>
           <w:szCs w:val="22"/>
         </w:rPr>
@@ -3699,7 +4010,7 @@
       </w:r>
       <w:r>
         <w:rPr>
-          <w:rFonts w:ascii="Arial" w:hAnsi="Arial" w:eastAsia="Arial" w:cs="Arial"/>
+          <w:rFonts w:ascii="Arial" w:hAnsi="Arial" w:cs="Arial"/>
           <w:color w:val="000000"/>
           <w:sz w:val="22"/>
           <w:szCs w:val="22"/>
@@ -3795,7 +4106,7 @@
       </w:r>
       <w:r>
         <w:rPr>
-          <w:rFonts w:ascii="Arial" w:hAnsi="Arial" w:eastAsia="Arial" w:cs="Arial"/>
+          <w:rFonts w:ascii="Arial" w:hAnsi="Arial" w:cs="Arial"/>
           <w:sz w:val="22"/>
           <w:szCs w:val="20"/>
         </w:rPr>
@@ -3870,7 +4181,7 @@
       </w:r>
       <w:r>
         <w:rPr>
-          <w:rFonts w:ascii="Arial" w:hAnsi="Arial" w:eastAsia="Arial" w:cs="Arial"/>
+          <w:rFonts w:ascii="Arial" w:hAnsi="Arial" w:cs="Arial"/>
           <w:sz w:val="22"/>
           <w:szCs w:val="20"/>
         </w:rPr>
@@ -3913,7 +4224,7 @@
       </w:r>
       <w:r>
         <w:rPr>
-          <w:rFonts w:ascii="Arial" w:hAnsi="Arial" w:eastAsia="Arial" w:cs="Arial"/>
+          <w:rFonts w:ascii="Arial" w:hAnsi="Arial" w:cs="Arial"/>
           <w:sz w:val="22"/>
           <w:szCs w:val="20"/>
         </w:rPr>
@@ -3973,7 +4284,7 @@
       </w:r>
       <w:r>
         <w:rPr>
-          <w:rFonts w:ascii="Arial" w:hAnsi="Arial" w:eastAsia="Arial" w:cs="Arial"/>
+          <w:rFonts w:ascii="Arial" w:hAnsi="Arial" w:cs="Arial"/>
           <w:sz w:val="22"/>
           <w:szCs w:val="20"/>
         </w:rPr>
@@ -4029,7 +4340,7 @@
       </w:r>
       <w:r>
         <w:rPr>
-          <w:rFonts w:ascii="Arial" w:hAnsi="Arial" w:eastAsia="Arial" w:cs="Arial"/>
+          <w:rFonts w:ascii="Arial" w:hAnsi="Arial" w:cs="Arial"/>
           <w:sz w:val="22"/>
           <w:szCs w:val="20"/>
         </w:rPr>
@@ -4104,7 +4415,7 @@
       </w:r>
       <w:r>
         <w:rPr>
-          <w:rFonts w:ascii="Arial" w:hAnsi="Arial" w:eastAsia="Arial" w:cs="Arial"/>
+          <w:rFonts w:ascii="Arial" w:hAnsi="Arial" w:cs="Arial"/>
           <w:sz w:val="22"/>
           <w:szCs w:val="20"/>
         </w:rPr>
@@ -4160,7 +4471,7 @@
       </w:r>
       <w:r>
         <w:rPr>
-          <w:rFonts w:ascii="Arial" w:hAnsi="Arial" w:eastAsia="Arial" w:cs="Arial"/>
+          <w:rFonts w:ascii="Arial" w:hAnsi="Arial" w:cs="Arial"/>
           <w:sz w:val="22"/>
           <w:szCs w:val="20"/>
         </w:rPr>
@@ -4203,7 +4514,7 @@
       </w:r>
       <w:r>
         <w:rPr>
-          <w:rFonts w:ascii="Arial" w:hAnsi="Arial" w:eastAsia="Arial" w:cs="Arial"/>
+          <w:rFonts w:ascii="Arial" w:hAnsi="Arial" w:cs="Arial"/>
           <w:sz w:val="22"/>
           <w:szCs w:val="20"/>
         </w:rPr>
@@ -4274,7 +4585,7 @@
       </w:r>
       <w:r>
         <w:rPr>
-          <w:rFonts w:ascii="Arial" w:hAnsi="Arial" w:eastAsia="Arial" w:cs="Arial"/>
+          <w:rFonts w:ascii="Arial" w:hAnsi="Arial" w:cs="Arial"/>
           <w:sz w:val="22"/>
           <w:szCs w:val="20"/>
         </w:rPr>
@@ -4349,7 +4660,7 @@
       </w:r>
       <w:r>
         <w:rPr>
-          <w:rFonts w:ascii="Arial" w:hAnsi="Arial" w:eastAsia="Arial" w:cs="Arial"/>
+          <w:rFonts w:ascii="Arial" w:hAnsi="Arial" w:cs="Arial"/>
           <w:sz w:val="22"/>
           <w:szCs w:val="20"/>
         </w:rPr>
@@ -4462,7 +4773,7 @@
       </w:r>
       <w:r>
         <w:rPr>
-          <w:rFonts w:ascii="Arial" w:hAnsi="Arial" w:eastAsia="Arial" w:cs="Arial"/>
+          <w:rFonts w:ascii="Arial" w:hAnsi="Arial" w:cs="Arial"/>
           <w:sz w:val="22"/>
           <w:szCs w:val="20"/>
         </w:rPr>
@@ -4594,7 +4905,7 @@
       </w:r>
       <w:r>
         <w:rPr>
-          <w:rFonts w:ascii="Arial" w:hAnsi="Arial" w:eastAsia="Arial" w:cs="Arial"/>
+          <w:rFonts w:ascii="Arial" w:hAnsi="Arial" w:cs="Arial"/>
           <w:sz w:val="22"/>
           <w:szCs w:val="20"/>
         </w:rPr>
@@ -4636,12 +4947,11 @@
       </w:r>
       <w:r>
         <w:rPr>
-          <w:rFonts w:ascii="Arial" w:hAnsi="Arial" w:eastAsia="Arial" w:cs="Arial"/>
+          <w:rFonts w:ascii="Arial" w:hAnsi="Arial" w:cs="Arial"/>
           <w:b/>
           <w:bCs/>
           <w:sz w:val="28"/>
           <w:szCs w:val="28"/>
-          <w:highlight w:val="none"/>
         </w:rPr>
       </w:r>
     </w:p>
@@ -4681,11 +4991,12 @@
       </w:r>
       <w:r>
         <w:rPr>
-          <w:rFonts w:ascii="Arial" w:hAnsi="Arial" w:eastAsia="Arial" w:cs="Arial"/>
+          <w:rFonts w:ascii="Arial" w:hAnsi="Arial" w:cs="Arial"/>
           <w:b/>
           <w:bCs/>
           <w:sz w:val="28"/>
           <w:szCs w:val="28"/>
+          <w:highlight w:val="none"/>
         </w:rPr>
       </w:r>
     </w:p>
@@ -4736,7 +5047,7 @@
       </w:r>
       <w:r>
         <w:rPr>
-          <w:rFonts w:ascii="Arial" w:hAnsi="Arial" w:eastAsia="Arial" w:cs="Arial"/>
+          <w:rFonts w:ascii="Arial" w:hAnsi="Arial" w:cs="Arial"/>
           <w:sz w:val="32"/>
           <w:szCs w:val="32"/>
           <w:highlight w:val="none"/>
@@ -4784,7 +5095,7 @@
       </w:r>
       <w:r>
         <w:rPr>
-          <w:rFonts w:ascii="Arial" w:hAnsi="Arial" w:eastAsia="Arial" w:cs="Arial"/>
+          <w:rFonts w:ascii="Arial" w:hAnsi="Arial" w:cs="Arial"/>
           <w:b/>
           <w:bCs/>
           <w:sz w:val="22"/>
@@ -4825,7 +5136,7 @@
       </w:r>
       <w:r>
         <w:rPr>
-          <w:rFonts w:ascii="Arial" w:hAnsi="Arial" w:eastAsia="Arial" w:cs="Arial"/>
+          <w:rFonts w:ascii="Arial" w:hAnsi="Arial" w:cs="Arial"/>
           <w:sz w:val="24"/>
           <w:szCs w:val="24"/>
         </w:rPr>
@@ -4886,6 +5197,11 @@
       <w:r>
         <w:rPr>
           <w:rFonts w:ascii="Arial" w:hAnsi="Arial" w:eastAsia="Arial" w:cs="Arial"/>
+        </w:rPr>
+      </w:r>
+      <w:r>
+        <w:rPr>
+          <w:rFonts w:ascii="Arial" w:hAnsi="Arial" w:cs="Arial"/>
         </w:rPr>
       </w:r>
     </w:p>
@@ -4951,6 +5267,11 @@
           <w:rFonts w:ascii="Arial" w:hAnsi="Arial" w:eastAsia="Arial" w:cs="Arial"/>
         </w:rPr>
       </w:r>
+      <w:r>
+        <w:rPr>
+          <w:rFonts w:ascii="Arial" w:hAnsi="Arial" w:cs="Arial"/>
+        </w:rPr>
+      </w:r>
     </w:p>
     <w:p>
       <w:pPr>
@@ -4993,6 +5314,11 @@
           <w:rFonts w:ascii="Arial" w:hAnsi="Arial" w:eastAsia="Arial" w:cs="Arial"/>
         </w:rPr>
       </w:r>
+      <w:r>
+        <w:rPr>
+          <w:rFonts w:ascii="Arial" w:hAnsi="Arial" w:cs="Arial"/>
+        </w:rPr>
+      </w:r>
     </w:p>
     <w:p>
       <w:pPr>
@@ -5023,7 +5349,7 @@
       </w:r>
       <w:r>
         <w:rPr>
-          <w:rFonts w:ascii="Arial" w:hAnsi="Arial" w:eastAsia="Arial" w:cs="Arial"/>
+          <w:rFonts w:ascii="Arial" w:hAnsi="Arial" w:cs="Arial"/>
           <w:sz w:val="24"/>
           <w:szCs w:val="24"/>
         </w:rPr>
@@ -5069,6 +5395,14 @@
           <w:szCs w:val="24"/>
         </w:rPr>
       </w:r>
+      <w:r>
+        <w:rPr>
+          <w:rFonts w:ascii="Arial" w:hAnsi="Arial" w:cs="Arial"/>
+          <w:sz w:val="24"/>
+          <w:szCs w:val="24"/>
+          <w:highlight w:val="none"/>
+        </w:rPr>
+      </w:r>
     </w:p>
     <w:p>
       <w:pPr>
@@ -5107,11 +5441,9 @@
       </w:r>
       <w:r>
         <w:rPr>
-          <w:rFonts w:ascii="Arial" w:hAnsi="Arial" w:eastAsia="Arial" w:cs="Arial"/>
+          <w:rFonts w:ascii="Arial" w:hAnsi="Arial" w:cs="Arial"/>
           <w:sz w:val="24"/>
           <w:szCs w:val="24"/>
-          <w:highlight w:val="none"/>
-          <w:lang w:val="es-ES"/>
         </w:rPr>
       </w:r>
     </w:p>
@@ -5158,7 +5490,7 @@
       </w:r>
       <w:r>
         <w:rPr>
-          <w:rFonts w:ascii="Arial" w:hAnsi="Arial" w:eastAsia="Arial" w:cs="Arial"/>
+          <w:rFonts w:ascii="Arial" w:hAnsi="Arial" w:cs="Arial"/>
           <w:b/>
           <w:bCs/>
           <w:sz w:val="28"/>
@@ -5200,7 +5532,7 @@
       </w:r>
       <w:r>
         <w:rPr>
-          <w:rFonts w:ascii="Arial" w:hAnsi="Arial" w:eastAsia="Arial" w:cs="Arial"/>
+          <w:rFonts w:ascii="Arial" w:hAnsi="Arial" w:cs="Arial"/>
           <w:sz w:val="24"/>
           <w:szCs w:val="24"/>
         </w:rPr>
@@ -5287,7 +5619,7 @@
             </w:r>
             <w:r>
               <w:rPr>
-                <w:rFonts w:ascii="Arial" w:hAnsi="Arial" w:eastAsia="Arial" w:cs="Arial"/>
+                <w:rFonts w:ascii="Arial" w:hAnsi="Arial" w:cs="Arial"/>
                 <w:b/>
                 <w:bCs/>
                 <w:sz w:val="24"/>
@@ -5354,7 +5686,7 @@
             </w:r>
             <w:r>
               <w:rPr>
-                <w:rFonts w:ascii="Arial" w:hAnsi="Arial" w:eastAsia="Arial" w:cs="Arial"/>
+                <w:rFonts w:ascii="Arial" w:hAnsi="Arial" w:cs="Arial"/>
                 <w:b/>
                 <w:bCs/>
                 <w:sz w:val="24"/>
@@ -5421,7 +5753,7 @@
             </w:r>
             <w:r>
               <w:rPr>
-                <w:rFonts w:ascii="Arial" w:hAnsi="Arial" w:eastAsia="Arial" w:cs="Arial"/>
+                <w:rFonts w:ascii="Arial" w:hAnsi="Arial" w:cs="Arial"/>
                 <w:b/>
                 <w:bCs/>
                 <w:sz w:val="24"/>
@@ -5488,7 +5820,7 @@
             </w:r>
             <w:r>
               <w:rPr>
-                <w:rFonts w:ascii="Arial" w:hAnsi="Arial" w:eastAsia="Arial" w:cs="Arial"/>
+                <w:rFonts w:ascii="Arial" w:hAnsi="Arial" w:cs="Arial"/>
                 <w:b/>
                 <w:bCs/>
                 <w:sz w:val="24"/>
@@ -5551,7 +5883,7 @@
             </w:r>
             <w:r>
               <w:rPr>
-                <w:rFonts w:ascii="Arial" w:hAnsi="Arial" w:eastAsia="Arial" w:cs="Arial"/>
+                <w:rFonts w:ascii="Arial" w:hAnsi="Arial" w:cs="Arial"/>
                 <w:sz w:val="24"/>
                 <w:szCs w:val="24"/>
                 <w14:ligatures w14:val="none"/>
@@ -5619,7 +5951,7 @@
             </w:r>
             <w:r>
               <w:rPr>
-                <w:rFonts w:ascii="Arial" w:hAnsi="Arial" w:eastAsia="Arial" w:cs="Arial"/>
+                <w:rFonts w:ascii="Arial" w:hAnsi="Arial" w:cs="Arial"/>
                 <w:b w:val="0"/>
                 <w:bCs w:val="0"/>
                 <w:i/>
@@ -5697,7 +6029,7 @@
             </w:r>
             <w:r>
               <w:rPr>
-                <w:rFonts w:ascii="Arial" w:hAnsi="Arial" w:eastAsia="Arial" w:cs="Arial"/>
+                <w:rFonts w:ascii="Arial" w:hAnsi="Arial" w:cs="Arial"/>
                 <w:sz w:val="24"/>
                 <w:szCs w:val="24"/>
                 <w14:ligatures w14:val="none"/>
@@ -5763,7 +6095,7 @@
             </w:r>
             <w:r>
               <w:rPr>
-                <w:rFonts w:ascii="Arial" w:hAnsi="Arial" w:eastAsia="Arial" w:cs="Arial"/>
+                <w:rFonts w:ascii="Arial" w:hAnsi="Arial" w:cs="Arial"/>
                 <w:sz w:val="24"/>
                 <w:szCs w:val="24"/>
                 <w14:ligatures w14:val="none"/>
@@ -5824,7 +6156,7 @@
             </w:r>
             <w:r>
               <w:rPr>
-                <w:rFonts w:ascii="Arial" w:hAnsi="Arial" w:eastAsia="Arial" w:cs="Arial"/>
+                <w:rFonts w:ascii="Arial" w:hAnsi="Arial" w:cs="Arial"/>
                 <w:sz w:val="24"/>
                 <w:szCs w:val="24"/>
                 <w14:ligatures w14:val="none"/>
@@ -5892,7 +6224,7 @@
             </w:r>
             <w:r>
               <w:rPr>
-                <w:rFonts w:ascii="Arial" w:hAnsi="Arial" w:eastAsia="Arial" w:cs="Arial"/>
+                <w:rFonts w:ascii="Arial" w:hAnsi="Arial" w:cs="Arial"/>
                 <w:b w:val="0"/>
                 <w:bCs w:val="0"/>
                 <w:i/>
@@ -5953,7 +6285,7 @@
             </w:r>
             <w:r>
               <w:rPr>
-                <w:rFonts w:ascii="Arial" w:hAnsi="Arial" w:eastAsia="Arial" w:cs="Arial"/>
+                <w:rFonts w:ascii="Arial" w:hAnsi="Arial" w:cs="Arial"/>
                 <w:sz w:val="24"/>
                 <w:szCs w:val="24"/>
                 <w14:ligatures w14:val="none"/>
@@ -6019,7 +6351,7 @@
             </w:r>
             <w:r>
               <w:rPr>
-                <w:rFonts w:ascii="Arial" w:hAnsi="Arial" w:eastAsia="Arial" w:cs="Arial"/>
+                <w:rFonts w:ascii="Arial" w:hAnsi="Arial" w:cs="Arial"/>
                 <w:sz w:val="24"/>
                 <w:szCs w:val="24"/>
                 <w14:ligatures w14:val="none"/>
@@ -6080,7 +6412,7 @@
             </w:r>
             <w:r>
               <w:rPr>
-                <w:rFonts w:ascii="Arial" w:hAnsi="Arial" w:eastAsia="Arial" w:cs="Arial"/>
+                <w:rFonts w:ascii="Arial" w:hAnsi="Arial" w:cs="Arial"/>
                 <w:sz w:val="24"/>
                 <w:szCs w:val="24"/>
                 <w14:ligatures w14:val="none"/>
@@ -6148,7 +6480,7 @@
             </w:r>
             <w:r>
               <w:rPr>
-                <w:rFonts w:ascii="Arial" w:hAnsi="Arial" w:eastAsia="Arial" w:cs="Arial"/>
+                <w:rFonts w:ascii="Arial" w:hAnsi="Arial" w:cs="Arial"/>
                 <w:b w:val="0"/>
                 <w:bCs w:val="0"/>
                 <w:i/>
@@ -6209,7 +6541,7 @@
             </w:r>
             <w:r>
               <w:rPr>
-                <w:rFonts w:ascii="Arial" w:hAnsi="Arial" w:eastAsia="Arial" w:cs="Arial"/>
+                <w:rFonts w:ascii="Arial" w:hAnsi="Arial" w:cs="Arial"/>
                 <w:sz w:val="24"/>
                 <w:szCs w:val="24"/>
                 <w14:ligatures w14:val="none"/>
@@ -6275,7 +6607,7 @@
             </w:r>
             <w:r>
               <w:rPr>
-                <w:rFonts w:ascii="Arial" w:hAnsi="Arial" w:eastAsia="Arial" w:cs="Arial"/>
+                <w:rFonts w:ascii="Arial" w:hAnsi="Arial" w:cs="Arial"/>
                 <w:sz w:val="24"/>
                 <w:szCs w:val="24"/>
                 <w14:ligatures w14:val="none"/>
@@ -6318,7 +6650,7 @@
       </w:r>
       <w:r>
         <w:rPr>
-          <w:rFonts w:ascii="Arial" w:hAnsi="Arial" w:eastAsia="Arial" w:cs="Arial"/>
+          <w:rFonts w:ascii="Arial" w:hAnsi="Arial" w:cs="Arial"/>
           <w:sz w:val="24"/>
           <w:szCs w:val="24"/>
         </w:rPr>
@@ -6367,7 +6699,7 @@
       </w:r>
       <w:r>
         <w:rPr>
-          <w:rFonts w:ascii="Arial" w:hAnsi="Arial" w:eastAsia="Arial" w:cs="Arial"/>
+          <w:rFonts w:ascii="Arial" w:hAnsi="Arial" w:cs="Arial"/>
           <w:b/>
           <w:bCs/>
           <w:sz w:val="28"/>
@@ -6399,6 +6731,13 @@
       <w:r>
         <w:rPr>
           <w:rFonts w:ascii="Arial" w:hAnsi="Arial" w:eastAsia="Arial" w:cs="Arial"/>
+          <w:sz w:val="24"/>
+          <w:szCs w:val="24"/>
+        </w:rPr>
+      </w:r>
+      <w:r>
+        <w:rPr>
+          <w:rFonts w:ascii="Arial" w:hAnsi="Arial" w:cs="Arial"/>
           <w:sz w:val="24"/>
           <w:szCs w:val="24"/>
         </w:rPr>
@@ -6478,13 +6817,6 @@
             <w:r>
               <w:rPr>
                 <w:rFonts w:ascii="Arial" w:hAnsi="Arial" w:eastAsia="Arial" w:cs="Arial"/>
-                <w:sz w:val="24"/>
-                <w:szCs w:val="24"/>
-              </w:rPr>
-            </w:r>
-            <w:r>
-              <w:rPr>
-                <w:rFonts w:ascii="Arial" w:hAnsi="Arial" w:eastAsia="Arial" w:cs="Arial"/>
                 <w:b/>
                 <w:color w:val="auto"/>
                 <w:sz w:val="24"/>
@@ -6504,6 +6836,14 @@
             <w:r>
               <w:rPr>
                 <w:rFonts w:ascii="Arial" w:hAnsi="Arial" w:eastAsia="Arial" w:cs="Arial"/>
+                <w:color w:val="auto"/>
+                <w:sz w:val="24"/>
+                <w:szCs w:val="24"/>
+              </w:rPr>
+            </w:r>
+            <w:r>
+              <w:rPr>
+                <w:rFonts w:ascii="Arial" w:hAnsi="Arial" w:cs="Arial"/>
                 <w:color w:val="auto"/>
                 <w:sz w:val="24"/>
                 <w:szCs w:val="24"/>
@@ -6575,6 +6915,14 @@
                 <w:szCs w:val="24"/>
               </w:rPr>
             </w:r>
+            <w:r>
+              <w:rPr>
+                <w:rFonts w:ascii="Arial" w:hAnsi="Arial" w:cs="Arial"/>
+                <w:color w:val="auto"/>
+                <w:sz w:val="24"/>
+                <w:szCs w:val="24"/>
+              </w:rPr>
+            </w:r>
           </w:p>
         </w:tc>
         <w:tc>
@@ -6636,6 +6984,14 @@
             <w:r>
               <w:rPr>
                 <w:rFonts w:ascii="Arial" w:hAnsi="Arial" w:eastAsia="Arial" w:cs="Arial"/>
+                <w:color w:val="auto"/>
+                <w:sz w:val="24"/>
+                <w:szCs w:val="24"/>
+              </w:rPr>
+            </w:r>
+            <w:r>
+              <w:rPr>
+                <w:rFonts w:ascii="Arial" w:hAnsi="Arial" w:cs="Arial"/>
                 <w:color w:val="auto"/>
                 <w:sz w:val="24"/>
                 <w:szCs w:val="24"/>
@@ -6712,6 +7068,14 @@
                 <w:szCs w:val="24"/>
               </w:rPr>
             </w:r>
+            <w:r>
+              <w:rPr>
+                <w:rFonts w:ascii="Arial" w:hAnsi="Arial" w:cs="Arial"/>
+                <w:color w:val="000000" w:themeColor="text1"/>
+                <w:sz w:val="24"/>
+                <w:szCs w:val="24"/>
+              </w:rPr>
+            </w:r>
           </w:p>
         </w:tc>
         <w:tc>
@@ -6771,6 +7135,14 @@
             <w:r>
               <w:rPr>
                 <w:rFonts w:ascii="Arial" w:hAnsi="Arial" w:eastAsia="Arial" w:cs="Arial"/>
+                <w:color w:val="auto"/>
+                <w:sz w:val="24"/>
+                <w:szCs w:val="24"/>
+              </w:rPr>
+            </w:r>
+            <w:r>
+              <w:rPr>
+                <w:rFonts w:ascii="Arial" w:hAnsi="Arial" w:cs="Arial"/>
                 <w:color w:val="auto"/>
                 <w:sz w:val="24"/>
                 <w:szCs w:val="24"/>
@@ -6836,6 +7208,14 @@
             <w:r>
               <w:rPr>
                 <w:rFonts w:ascii="Arial" w:hAnsi="Arial" w:eastAsia="Arial" w:cs="Arial"/>
+                <w:color w:val="auto"/>
+                <w:sz w:val="24"/>
+                <w:szCs w:val="24"/>
+              </w:rPr>
+            </w:r>
+            <w:r>
+              <w:rPr>
+                <w:rFonts w:ascii="Arial" w:hAnsi="Arial" w:cs="Arial"/>
                 <w:color w:val="auto"/>
                 <w:sz w:val="24"/>
                 <w:szCs w:val="24"/>
@@ -6912,6 +7292,14 @@
                 <w:szCs w:val="24"/>
               </w:rPr>
             </w:r>
+            <w:r>
+              <w:rPr>
+                <w:rFonts w:ascii="Arial" w:hAnsi="Arial" w:cs="Arial"/>
+                <w:color w:val="000000" w:themeColor="text1"/>
+                <w:sz w:val="24"/>
+                <w:szCs w:val="24"/>
+              </w:rPr>
+            </w:r>
           </w:p>
         </w:tc>
         <w:tc>
@@ -6971,6 +7359,14 @@
             <w:r>
               <w:rPr>
                 <w:rFonts w:ascii="Arial" w:hAnsi="Arial" w:eastAsia="Arial" w:cs="Arial"/>
+                <w:color w:val="auto"/>
+                <w:sz w:val="24"/>
+                <w:szCs w:val="24"/>
+              </w:rPr>
+            </w:r>
+            <w:r>
+              <w:rPr>
+                <w:rFonts w:ascii="Arial" w:hAnsi="Arial" w:cs="Arial"/>
                 <w:color w:val="auto"/>
                 <w:sz w:val="24"/>
                 <w:szCs w:val="24"/>
@@ -7036,6 +7432,14 @@
             <w:r>
               <w:rPr>
                 <w:rFonts w:ascii="Arial" w:hAnsi="Arial" w:eastAsia="Arial" w:cs="Arial"/>
+                <w:color w:val="auto"/>
+                <w:sz w:val="24"/>
+                <w:szCs w:val="24"/>
+              </w:rPr>
+            </w:r>
+            <w:r>
+              <w:rPr>
+                <w:rFonts w:ascii="Arial" w:hAnsi="Arial" w:cs="Arial"/>
                 <w:color w:val="auto"/>
                 <w:sz w:val="24"/>
                 <w:szCs w:val="24"/>
@@ -7112,6 +7516,14 @@
                 <w:szCs w:val="24"/>
               </w:rPr>
             </w:r>
+            <w:r>
+              <w:rPr>
+                <w:rFonts w:ascii="Arial" w:hAnsi="Arial" w:cs="Arial"/>
+                <w:color w:val="000000" w:themeColor="text1"/>
+                <w:sz w:val="24"/>
+                <w:szCs w:val="24"/>
+              </w:rPr>
+            </w:r>
           </w:p>
         </w:tc>
         <w:tc>
@@ -7171,6 +7583,14 @@
             <w:r>
               <w:rPr>
                 <w:rFonts w:ascii="Arial" w:hAnsi="Arial" w:eastAsia="Arial" w:cs="Arial"/>
+                <w:color w:val="auto"/>
+                <w:sz w:val="24"/>
+                <w:szCs w:val="24"/>
+              </w:rPr>
+            </w:r>
+            <w:r>
+              <w:rPr>
+                <w:rFonts w:ascii="Arial" w:hAnsi="Arial" w:cs="Arial"/>
                 <w:color w:val="auto"/>
                 <w:sz w:val="24"/>
                 <w:szCs w:val="24"/>
@@ -7236,6 +7656,14 @@
             <w:r>
               <w:rPr>
                 <w:rFonts w:ascii="Arial" w:hAnsi="Arial" w:eastAsia="Arial" w:cs="Arial"/>
+                <w:color w:val="auto"/>
+                <w:sz w:val="24"/>
+                <w:szCs w:val="24"/>
+              </w:rPr>
+            </w:r>
+            <w:r>
+              <w:rPr>
+                <w:rFonts w:ascii="Arial" w:hAnsi="Arial" w:cs="Arial"/>
                 <w:color w:val="auto"/>
                 <w:sz w:val="24"/>
                 <w:szCs w:val="24"/>
@@ -7312,6 +7740,14 @@
                 <w:szCs w:val="24"/>
               </w:rPr>
             </w:r>
+            <w:r>
+              <w:rPr>
+                <w:rFonts w:ascii="Arial" w:hAnsi="Arial" w:cs="Arial"/>
+                <w:color w:val="000000" w:themeColor="text1"/>
+                <w:sz w:val="24"/>
+                <w:szCs w:val="24"/>
+              </w:rPr>
+            </w:r>
           </w:p>
         </w:tc>
         <w:tc>
@@ -7371,6 +7807,14 @@
             <w:r>
               <w:rPr>
                 <w:rFonts w:ascii="Arial" w:hAnsi="Arial" w:eastAsia="Arial" w:cs="Arial"/>
+                <w:color w:val="auto"/>
+                <w:sz w:val="24"/>
+                <w:szCs w:val="24"/>
+              </w:rPr>
+            </w:r>
+            <w:r>
+              <w:rPr>
+                <w:rFonts w:ascii="Arial" w:hAnsi="Arial" w:cs="Arial"/>
                 <w:color w:val="auto"/>
                 <w:sz w:val="24"/>
                 <w:szCs w:val="24"/>
@@ -7436,6 +7880,14 @@
             <w:r>
               <w:rPr>
                 <w:rFonts w:ascii="Arial" w:hAnsi="Arial" w:eastAsia="Arial" w:cs="Arial"/>
+                <w:color w:val="auto"/>
+                <w:sz w:val="24"/>
+                <w:szCs w:val="24"/>
+              </w:rPr>
+            </w:r>
+            <w:r>
+              <w:rPr>
+                <w:rFonts w:ascii="Arial" w:hAnsi="Arial" w:cs="Arial"/>
                 <w:color w:val="auto"/>
                 <w:sz w:val="24"/>
                 <w:szCs w:val="24"/>
@@ -7512,6 +7964,14 @@
                 <w:szCs w:val="24"/>
               </w:rPr>
             </w:r>
+            <w:r>
+              <w:rPr>
+                <w:rFonts w:ascii="Arial" w:hAnsi="Arial" w:cs="Arial"/>
+                <w:color w:val="000000" w:themeColor="text1"/>
+                <w:sz w:val="24"/>
+                <w:szCs w:val="24"/>
+              </w:rPr>
+            </w:r>
           </w:p>
         </w:tc>
         <w:tc>
@@ -7571,6 +8031,14 @@
             <w:r>
               <w:rPr>
                 <w:rFonts w:ascii="Arial" w:hAnsi="Arial" w:eastAsia="Arial" w:cs="Arial"/>
+                <w:color w:val="auto"/>
+                <w:sz w:val="24"/>
+                <w:szCs w:val="24"/>
+              </w:rPr>
+            </w:r>
+            <w:r>
+              <w:rPr>
+                <w:rFonts w:ascii="Arial" w:hAnsi="Arial" w:cs="Arial"/>
                 <w:color w:val="auto"/>
                 <w:sz w:val="24"/>
                 <w:szCs w:val="24"/>
@@ -7636,6 +8104,14 @@
             <w:r>
               <w:rPr>
                 <w:rFonts w:ascii="Arial" w:hAnsi="Arial" w:eastAsia="Arial" w:cs="Arial"/>
+                <w:color w:val="auto"/>
+                <w:sz w:val="24"/>
+                <w:szCs w:val="24"/>
+              </w:rPr>
+            </w:r>
+            <w:r>
+              <w:rPr>
+                <w:rFonts w:ascii="Arial" w:hAnsi="Arial" w:cs="Arial"/>
                 <w:color w:val="auto"/>
                 <w:sz w:val="24"/>
                 <w:szCs w:val="24"/>
@@ -7712,6 +8188,14 @@
                 <w:szCs w:val="24"/>
               </w:rPr>
             </w:r>
+            <w:r>
+              <w:rPr>
+                <w:rFonts w:ascii="Arial" w:hAnsi="Arial" w:cs="Arial"/>
+                <w:color w:val="000000" w:themeColor="text1"/>
+                <w:sz w:val="24"/>
+                <w:szCs w:val="24"/>
+              </w:rPr>
+            </w:r>
           </w:p>
         </w:tc>
         <w:tc>
@@ -7771,6 +8255,14 @@
             <w:r>
               <w:rPr>
                 <w:rFonts w:ascii="Arial" w:hAnsi="Arial" w:eastAsia="Arial" w:cs="Arial"/>
+                <w:color w:val="auto"/>
+                <w:sz w:val="24"/>
+                <w:szCs w:val="24"/>
+              </w:rPr>
+            </w:r>
+            <w:r>
+              <w:rPr>
+                <w:rFonts w:ascii="Arial" w:hAnsi="Arial" w:cs="Arial"/>
                 <w:color w:val="auto"/>
                 <w:sz w:val="24"/>
                 <w:szCs w:val="24"/>
@@ -7836,6 +8328,14 @@
             <w:r>
               <w:rPr>
                 <w:rFonts w:ascii="Arial" w:hAnsi="Arial" w:eastAsia="Arial" w:cs="Arial"/>
+                <w:color w:val="auto"/>
+                <w:sz w:val="24"/>
+                <w:szCs w:val="24"/>
+              </w:rPr>
+            </w:r>
+            <w:r>
+              <w:rPr>
+                <w:rFonts w:ascii="Arial" w:hAnsi="Arial" w:cs="Arial"/>
                 <w:color w:val="auto"/>
                 <w:sz w:val="24"/>
                 <w:szCs w:val="24"/>
@@ -7912,6 +8412,14 @@
                 <w:szCs w:val="24"/>
               </w:rPr>
             </w:r>
+            <w:r>
+              <w:rPr>
+                <w:rFonts w:ascii="Arial" w:hAnsi="Arial" w:cs="Arial"/>
+                <w:color w:val="000000" w:themeColor="text1"/>
+                <w:sz w:val="24"/>
+                <w:szCs w:val="24"/>
+              </w:rPr>
+            </w:r>
           </w:p>
         </w:tc>
         <w:tc>
@@ -7971,6 +8479,14 @@
             <w:r>
               <w:rPr>
                 <w:rFonts w:ascii="Arial" w:hAnsi="Arial" w:eastAsia="Arial" w:cs="Arial"/>
+                <w:color w:val="auto"/>
+                <w:sz w:val="24"/>
+                <w:szCs w:val="24"/>
+              </w:rPr>
+            </w:r>
+            <w:r>
+              <w:rPr>
+                <w:rFonts w:ascii="Arial" w:hAnsi="Arial" w:cs="Arial"/>
                 <w:color w:val="auto"/>
                 <w:sz w:val="24"/>
                 <w:szCs w:val="24"/>
@@ -8041,6 +8557,14 @@
                 <w:szCs w:val="24"/>
               </w:rPr>
             </w:r>
+            <w:r>
+              <w:rPr>
+                <w:rFonts w:ascii="Arial" w:hAnsi="Arial" w:cs="Arial"/>
+                <w:color w:val="auto"/>
+                <w:sz w:val="24"/>
+                <w:szCs w:val="24"/>
+              </w:rPr>
+            </w:r>
           </w:p>
         </w:tc>
       </w:tr>
@@ -8068,13 +8592,13 @@
       <w:r>
         <w:rPr>
           <w:rFonts w:ascii="Arial" w:hAnsi="Arial" w:eastAsia="Arial" w:cs="Arial"/>
+        </w:rPr>
+      </w:r>
+      <w:r>
+        <w:rPr>
+          <w:rFonts w:ascii="Arial" w:hAnsi="Arial" w:cs="Arial"/>
           <w:sz w:val="24"/>
           <w:szCs w:val="24"/>
-        </w:rPr>
-      </w:r>
-      <w:r>
-        <w:rPr>
-          <w:rFonts w:ascii="Arial" w:hAnsi="Arial" w:eastAsia="Arial" w:cs="Arial"/>
         </w:rPr>
       </w:r>
     </w:p>
@@ -8118,6 +8642,16 @@
           <w:highlight w:val="none"/>
         </w:rPr>
       </w:r>
+      <w:r>
+        <w:rPr>
+          <w:rFonts w:ascii="Arial" w:hAnsi="Arial" w:cs="Arial"/>
+          <w:b/>
+          <w:bCs/>
+          <w:sz w:val="28"/>
+          <w:szCs w:val="28"/>
+          <w:highlight w:val="none"/>
+        </w:rPr>
+      </w:r>
     </w:p>
     <w:p>
       <w:pPr>
@@ -8152,7 +8686,7 @@
       </w:r>
       <w:r>
         <w:rPr>
-          <w:rFonts w:ascii="Arial" w:hAnsi="Arial" w:eastAsia="Arial" w:cs="Arial"/>
+          <w:rFonts w:ascii="Arial" w:hAnsi="Arial" w:cs="Arial"/>
           <w:sz w:val="24"/>
           <w:szCs w:val="24"/>
         </w:rPr>
@@ -8230,6 +8764,13 @@
                 <w:szCs w:val="22"/>
               </w:rPr>
             </w:r>
+            <w:r>
+              <w:rPr>
+                <w:rFonts w:ascii="Arial" w:hAnsi="Arial" w:cs="Arial"/>
+                <w:sz w:val="22"/>
+                <w:szCs w:val="22"/>
+              </w:rPr>
+            </w:r>
           </w:p>
         </w:tc>
         <w:tc>
@@ -8276,6 +8817,13 @@
             <w:r>
               <w:rPr>
                 <w:rFonts w:ascii="Arial" w:hAnsi="Arial" w:eastAsia="Arial" w:cs="Arial"/>
+                <w:sz w:val="22"/>
+                <w:szCs w:val="22"/>
+              </w:rPr>
+            </w:r>
+            <w:r>
+              <w:rPr>
+                <w:rFonts w:ascii="Arial" w:hAnsi="Arial" w:cs="Arial"/>
                 <w:sz w:val="22"/>
                 <w:szCs w:val="22"/>
               </w:rPr>
@@ -8330,6 +8878,13 @@
                 <w:szCs w:val="22"/>
               </w:rPr>
             </w:r>
+            <w:r>
+              <w:rPr>
+                <w:rFonts w:ascii="Arial" w:hAnsi="Arial" w:cs="Arial"/>
+                <w:sz w:val="22"/>
+                <w:szCs w:val="22"/>
+              </w:rPr>
+            </w:r>
           </w:p>
         </w:tc>
         <w:tc>
@@ -8376,6 +8931,13 @@
             <w:r>
               <w:rPr>
                 <w:rFonts w:ascii="Arial" w:hAnsi="Arial" w:eastAsia="Arial" w:cs="Arial"/>
+                <w:sz w:val="22"/>
+                <w:szCs w:val="22"/>
+              </w:rPr>
+            </w:r>
+            <w:r>
+              <w:rPr>
+                <w:rFonts w:ascii="Arial" w:hAnsi="Arial" w:cs="Arial"/>
                 <w:sz w:val="22"/>
                 <w:szCs w:val="22"/>
               </w:rPr>
@@ -8434,6 +8996,13 @@
                 <w:szCs w:val="22"/>
               </w:rPr>
             </w:r>
+            <w:r>
+              <w:rPr>
+                <w:rFonts w:ascii="Arial" w:hAnsi="Arial" w:cs="Arial"/>
+                <w:sz w:val="22"/>
+                <w:szCs w:val="22"/>
+              </w:rPr>
+            </w:r>
           </w:p>
         </w:tc>
         <w:tc>
@@ -8478,6 +9047,13 @@
             <w:r>
               <w:rPr>
                 <w:rFonts w:ascii="Arial" w:hAnsi="Arial" w:eastAsia="Arial" w:cs="Arial"/>
+                <w:sz w:val="22"/>
+                <w:szCs w:val="22"/>
+              </w:rPr>
+            </w:r>
+            <w:r>
+              <w:rPr>
+                <w:rFonts w:ascii="Arial" w:hAnsi="Arial" w:cs="Arial"/>
                 <w:sz w:val="22"/>
                 <w:szCs w:val="22"/>
               </w:rPr>
@@ -8530,6 +9106,13 @@
                 <w:szCs w:val="22"/>
               </w:rPr>
             </w:r>
+            <w:r>
+              <w:rPr>
+                <w:rFonts w:ascii="Arial" w:hAnsi="Arial" w:cs="Arial"/>
+                <w:sz w:val="22"/>
+                <w:szCs w:val="22"/>
+              </w:rPr>
+            </w:r>
           </w:p>
         </w:tc>
         <w:tc>
@@ -8574,6 +9157,13 @@
             <w:r>
               <w:rPr>
                 <w:rFonts w:ascii="Arial" w:hAnsi="Arial" w:eastAsia="Arial" w:cs="Arial"/>
+                <w:sz w:val="22"/>
+                <w:szCs w:val="22"/>
+              </w:rPr>
+            </w:r>
+            <w:r>
+              <w:rPr>
+                <w:rFonts w:ascii="Arial" w:hAnsi="Arial" w:cs="Arial"/>
                 <w:sz w:val="22"/>
                 <w:szCs w:val="22"/>
               </w:rPr>
@@ -8632,6 +9222,13 @@
                 <w:szCs w:val="22"/>
               </w:rPr>
             </w:r>
+            <w:r>
+              <w:rPr>
+                <w:rFonts w:ascii="Arial" w:hAnsi="Arial" w:cs="Arial"/>
+                <w:sz w:val="22"/>
+                <w:szCs w:val="22"/>
+              </w:rPr>
+            </w:r>
           </w:p>
         </w:tc>
         <w:tc>
@@ -8676,6 +9273,13 @@
             <w:r>
               <w:rPr>
                 <w:rFonts w:ascii="Arial" w:hAnsi="Arial" w:eastAsia="Arial" w:cs="Arial"/>
+                <w:sz w:val="22"/>
+                <w:szCs w:val="22"/>
+              </w:rPr>
+            </w:r>
+            <w:r>
+              <w:rPr>
+                <w:rFonts w:ascii="Arial" w:hAnsi="Arial" w:cs="Arial"/>
                 <w:sz w:val="22"/>
                 <w:szCs w:val="22"/>
               </w:rPr>
@@ -8728,6 +9332,13 @@
                 <w:szCs w:val="22"/>
               </w:rPr>
             </w:r>
+            <w:r>
+              <w:rPr>
+                <w:rFonts w:ascii="Arial" w:hAnsi="Arial" w:cs="Arial"/>
+                <w:sz w:val="22"/>
+                <w:szCs w:val="22"/>
+              </w:rPr>
+            </w:r>
           </w:p>
         </w:tc>
         <w:tc>
@@ -8772,6 +9383,13 @@
             <w:r>
               <w:rPr>
                 <w:rFonts w:ascii="Arial" w:hAnsi="Arial" w:eastAsia="Arial" w:cs="Arial"/>
+                <w:sz w:val="22"/>
+                <w:szCs w:val="22"/>
+              </w:rPr>
+            </w:r>
+            <w:r>
+              <w:rPr>
+                <w:rFonts w:ascii="Arial" w:hAnsi="Arial" w:cs="Arial"/>
                 <w:sz w:val="22"/>
                 <w:szCs w:val="22"/>
               </w:rPr>
@@ -8830,6 +9448,13 @@
                 <w:szCs w:val="22"/>
               </w:rPr>
             </w:r>
+            <w:r>
+              <w:rPr>
+                <w:rFonts w:ascii="Arial" w:hAnsi="Arial" w:cs="Arial"/>
+                <w:sz w:val="22"/>
+                <w:szCs w:val="22"/>
+              </w:rPr>
+            </w:r>
           </w:p>
         </w:tc>
         <w:tc>
@@ -8874,6 +9499,13 @@
             <w:r>
               <w:rPr>
                 <w:rFonts w:ascii="Arial" w:hAnsi="Arial" w:eastAsia="Arial" w:cs="Arial"/>
+                <w:sz w:val="22"/>
+                <w:szCs w:val="22"/>
+              </w:rPr>
+            </w:r>
+            <w:r>
+              <w:rPr>
+                <w:rFonts w:ascii="Arial" w:hAnsi="Arial" w:cs="Arial"/>
                 <w:sz w:val="22"/>
                 <w:szCs w:val="22"/>
               </w:rPr>
@@ -8926,6 +9558,13 @@
                 <w:szCs w:val="22"/>
               </w:rPr>
             </w:r>
+            <w:r>
+              <w:rPr>
+                <w:rFonts w:ascii="Arial" w:hAnsi="Arial" w:cs="Arial"/>
+                <w:sz w:val="22"/>
+                <w:szCs w:val="22"/>
+              </w:rPr>
+            </w:r>
           </w:p>
         </w:tc>
         <w:tc>
@@ -8970,6 +9609,13 @@
             <w:r>
               <w:rPr>
                 <w:rFonts w:ascii="Arial" w:hAnsi="Arial" w:eastAsia="Arial" w:cs="Arial"/>
+                <w:sz w:val="22"/>
+                <w:szCs w:val="22"/>
+              </w:rPr>
+            </w:r>
+            <w:r>
+              <w:rPr>
+                <w:rFonts w:ascii="Arial" w:hAnsi="Arial" w:cs="Arial"/>
                 <w:sz w:val="22"/>
                 <w:szCs w:val="22"/>
               </w:rPr>
@@ -9028,6 +9674,13 @@
                 <w:szCs w:val="22"/>
               </w:rPr>
             </w:r>
+            <w:r>
+              <w:rPr>
+                <w:rFonts w:ascii="Arial" w:hAnsi="Arial" w:cs="Arial"/>
+                <w:sz w:val="22"/>
+                <w:szCs w:val="22"/>
+              </w:rPr>
+            </w:r>
           </w:p>
         </w:tc>
         <w:tc>
@@ -9072,6 +9725,13 @@
             <w:r>
               <w:rPr>
                 <w:rFonts w:ascii="Arial" w:hAnsi="Arial" w:eastAsia="Arial" w:cs="Arial"/>
+                <w:sz w:val="22"/>
+                <w:szCs w:val="22"/>
+              </w:rPr>
+            </w:r>
+            <w:r>
+              <w:rPr>
+                <w:rFonts w:ascii="Arial" w:hAnsi="Arial" w:cs="Arial"/>
                 <w:sz w:val="22"/>
                 <w:szCs w:val="22"/>
               </w:rPr>
@@ -9124,6 +9784,13 @@
                 <w:szCs w:val="22"/>
               </w:rPr>
             </w:r>
+            <w:r>
+              <w:rPr>
+                <w:rFonts w:ascii="Arial" w:hAnsi="Arial" w:cs="Arial"/>
+                <w:sz w:val="22"/>
+                <w:szCs w:val="22"/>
+              </w:rPr>
+            </w:r>
           </w:p>
         </w:tc>
         <w:tc>
@@ -9172,6 +9839,13 @@
                 <w:szCs w:val="22"/>
               </w:rPr>
             </w:r>
+            <w:r>
+              <w:rPr>
+                <w:rFonts w:ascii="Arial" w:hAnsi="Arial" w:cs="Arial"/>
+                <w:sz w:val="22"/>
+                <w:szCs w:val="22"/>
+              </w:rPr>
+            </w:r>
           </w:p>
         </w:tc>
       </w:tr>
@@ -9206,7 +9880,7 @@
       </w:r>
       <w:r>
         <w:rPr>
-          <w:rFonts w:ascii="Arial" w:hAnsi="Arial" w:eastAsia="Arial" w:cs="Arial"/>
+          <w:rFonts w:ascii="Arial" w:hAnsi="Arial" w:cs="Arial"/>
           <w:sz w:val="32"/>
           <w:szCs w:val="32"/>
         </w:rPr>
@@ -9215,7 +9889,7 @@
     <w:p>
       <w:pPr>
         <w:pBdr/>
-        <w:shd w:val="nil"/>
+        <w:shd w:val="nil" w:color="auto"/>
         <w:spacing/>
         <w:ind/>
         <w:rPr>
@@ -9247,7 +9921,7 @@
       </w:r>
       <w:r>
         <w:rPr>
-          <w:rFonts w:ascii="Arial" w:hAnsi="Arial" w:eastAsia="Arial" w:cs="Arial"/>
+          <w:rFonts w:ascii="Arial" w:hAnsi="Arial" w:cs="Arial"/>
           <w:b/>
           <w:bCs/>
           <w:sz w:val="28"/>
@@ -9273,6 +9947,11 @@
       <w:r>
         <w:rPr>
           <w:rFonts w:ascii="Arial" w:hAnsi="Arial" w:eastAsia="Arial" w:cs="Arial"/>
+        </w:rPr>
+      </w:r>
+      <w:r>
+        <w:rPr>
+          <w:rFonts w:ascii="Arial" w:hAnsi="Arial" w:cs="Arial"/>
         </w:rPr>
       </w:r>
     </w:p>
@@ -9307,6 +9986,11 @@
           <w:rFonts w:ascii="Arial" w:hAnsi="Arial" w:eastAsia="Arial" w:cs="Arial"/>
         </w:rPr>
       </w:r>
+      <w:r>
+        <w:rPr>
+          <w:rFonts w:ascii="Arial" w:hAnsi="Arial" w:cs="Arial"/>
+        </w:rPr>
+      </w:r>
     </w:p>
     <w:p>
       <w:pPr>
@@ -9326,6 +10010,11 @@
       <w:r>
         <w:rPr>
           <w:rFonts w:ascii="Arial" w:hAnsi="Arial" w:eastAsia="Arial" w:cs="Arial"/>
+        </w:rPr>
+      </w:r>
+      <w:r>
+        <w:rPr>
+          <w:rFonts w:ascii="Arial" w:hAnsi="Arial" w:cs="Arial"/>
         </w:rPr>
       </w:r>
     </w:p>
@@ -9372,6 +10061,11 @@
       <w:r>
         <w:rPr>
           <w:rFonts w:ascii="Arial" w:hAnsi="Arial" w:eastAsia="Arial" w:cs="Arial"/>
+        </w:rPr>
+      </w:r>
+      <w:r>
+        <w:rPr>
+          <w:rFonts w:ascii="Arial" w:hAnsi="Arial" w:cs="Arial"/>
         </w:rPr>
       </w:r>
     </w:p>
@@ -9416,6 +10110,11 @@
           <w:rFonts w:ascii="Arial" w:hAnsi="Arial" w:eastAsia="Arial" w:cs="Arial"/>
         </w:rPr>
       </w:r>
+      <w:r>
+        <w:rPr>
+          <w:rFonts w:ascii="Arial" w:hAnsi="Arial" w:cs="Arial"/>
+        </w:rPr>
+      </w:r>
     </w:p>
     <w:p>
       <w:pPr>
@@ -9493,6 +10192,11 @@
           <w:rFonts w:ascii="Arial" w:hAnsi="Arial" w:eastAsia="Arial" w:cs="Arial"/>
         </w:rPr>
       </w:r>
+      <w:r>
+        <w:rPr>
+          <w:rFonts w:ascii="Arial" w:hAnsi="Arial" w:cs="Arial"/>
+        </w:rPr>
+      </w:r>
     </w:p>
     <w:p>
       <w:pPr>
@@ -9537,6 +10241,11 @@
       <w:r>
         <w:rPr>
           <w:rFonts w:ascii="Arial" w:hAnsi="Arial" w:eastAsia="Arial" w:cs="Arial"/>
+        </w:rPr>
+      </w:r>
+      <w:r>
+        <w:rPr>
+          <w:rFonts w:ascii="Arial" w:hAnsi="Arial" w:cs="Arial"/>
         </w:rPr>
       </w:r>
     </w:p>
@@ -9581,6 +10290,11 @@
           <w:rFonts w:ascii="Arial" w:hAnsi="Arial" w:eastAsia="Arial" w:cs="Arial"/>
         </w:rPr>
       </w:r>
+      <w:r>
+        <w:rPr>
+          <w:rFonts w:ascii="Arial" w:hAnsi="Arial" w:cs="Arial"/>
+        </w:rPr>
+      </w:r>
     </w:p>
     <w:p>
       <w:pPr>
@@ -9640,6 +10354,11 @@
           <w:rFonts w:ascii="Arial" w:hAnsi="Arial" w:eastAsia="Arial" w:cs="Arial"/>
         </w:rPr>
       </w:r>
+      <w:r>
+        <w:rPr>
+          <w:rFonts w:ascii="Arial" w:hAnsi="Arial" w:cs="Arial"/>
+        </w:rPr>
+      </w:r>
     </w:p>
     <w:p>
       <w:pPr>
@@ -9684,6 +10403,11 @@
       <w:r>
         <w:rPr>
           <w:rFonts w:ascii="Arial" w:hAnsi="Arial" w:eastAsia="Arial" w:cs="Arial"/>
+        </w:rPr>
+      </w:r>
+      <w:r>
+        <w:rPr>
+          <w:rFonts w:ascii="Arial" w:hAnsi="Arial" w:cs="Arial"/>
         </w:rPr>
       </w:r>
     </w:p>
@@ -9743,6 +10467,11 @@
       <w:r>
         <w:rPr>
           <w:rFonts w:ascii="Arial" w:hAnsi="Arial" w:eastAsia="Arial" w:cs="Arial"/>
+        </w:rPr>
+      </w:r>
+      <w:r>
+        <w:rPr>
+          <w:rFonts w:ascii="Arial" w:hAnsi="Arial" w:cs="Arial"/>
         </w:rPr>
       </w:r>
     </w:p>
@@ -9826,7 +10555,7 @@
                         <pic:nvPr/>
                       </pic:nvPicPr>
                       <pic:blipFill rotWithShape="1">
-                        <a:blip r:embed="rId24"/>
+                        <a:blip r:embed="rId27"/>
                         <a:stretch/>
                       </pic:blipFill>
                       <pic:spPr bwMode="auto">
@@ -9866,7 +10595,7 @@
                 <o:lock v:ext="edit" aspectratio="t"/>
               </v:shapetype>
               <v:shape id="_x0000_i23" o:spid="_x0000_s23" type="#_x0000_t75" style="width:135.83pt;height:276.31pt;mso-wrap-distance-left:0.00pt;mso-wrap-distance-top:0.00pt;mso-wrap-distance-right:0.00pt;mso-wrap-distance-bottom:0.00pt;z-index:1;" stroked="false">
-                <v:imagedata r:id="rId24" o:title=""/>
+                <v:imagedata r:id="rId27" o:title=""/>
                 <o:lock v:ext="edit" rotation="t"/>
               </v:shape>
             </w:pict>
@@ -9898,7 +10627,7 @@
                         <pic:nvPr/>
                       </pic:nvPicPr>
                       <pic:blipFill rotWithShape="1">
-                        <a:blip r:embed="rId25"/>
+                        <a:blip r:embed="rId28"/>
                         <a:stretch/>
                       </pic:blipFill>
                       <pic:spPr bwMode="auto">
@@ -9938,7 +10667,7 @@
                 <o:lock v:ext="edit" aspectratio="t"/>
               </v:shapetype>
               <v:shape id="_x0000_i24" o:spid="_x0000_s24" type="#_x0000_t75" style="width:136.24pt;height:276.31pt;mso-wrap-distance-left:0.00pt;mso-wrap-distance-top:0.00pt;mso-wrap-distance-right:0.00pt;mso-wrap-distance-bottom:0.00pt;z-index:1;" stroked="false">
-                <v:imagedata r:id="rId25" o:title=""/>
+                <v:imagedata r:id="rId28" o:title=""/>
                 <o:lock v:ext="edit" rotation="t"/>
               </v:shape>
             </w:pict>
@@ -9970,7 +10699,7 @@
                         <pic:nvPr/>
                       </pic:nvPicPr>
                       <pic:blipFill rotWithShape="1">
-                        <a:blip r:embed="rId26"/>
+                        <a:blip r:embed="rId29"/>
                         <a:stretch/>
                       </pic:blipFill>
                       <pic:spPr bwMode="auto">
@@ -10010,7 +10739,7 @@
                 <o:lock v:ext="edit" aspectratio="t"/>
               </v:shapetype>
               <v:shape id="_x0000_i25" o:spid="_x0000_s25" type="#_x0000_t75" style="width:143.39pt;height:269.99pt;mso-wrap-distance-left:0.00pt;mso-wrap-distance-top:0.00pt;mso-wrap-distance-right:0.00pt;mso-wrap-distance-bottom:0.00pt;z-index:1;" stroked="false">
-                <v:imagedata r:id="rId26" o:title=""/>
+                <v:imagedata r:id="rId29" o:title=""/>
                 <o:lock v:ext="edit" rotation="t"/>
               </v:shape>
             </w:pict>
@@ -10020,12 +10749,11 @@
       <w:r>
         <w:rPr>
           <w:rFonts w:ascii="Arial" w:hAnsi="Arial" w:eastAsia="Arial" w:cs="Arial"/>
-          <w:sz w:val="24"/>
-        </w:rPr>
-      </w:r>
-      <w:r>
-        <w:rPr>
-          <w:rFonts w:ascii="Arial" w:hAnsi="Arial" w:eastAsia="Arial" w:cs="Arial"/>
+        </w:rPr>
+      </w:r>
+      <w:r>
+        <w:rPr>
+          <w:rFonts w:ascii="Arial" w:hAnsi="Arial" w:cs="Arial"/>
         </w:rPr>
       </w:r>
     </w:p>
@@ -10075,6 +10803,11 @@
       <w:r>
         <w:rPr>
           <w:rFonts w:ascii="Arial" w:hAnsi="Arial" w:eastAsia="Arial" w:cs="Arial"/>
+        </w:rPr>
+      </w:r>
+      <w:r>
+        <w:rPr>
+          <w:rFonts w:ascii="Arial" w:hAnsi="Arial" w:cs="Arial"/>
         </w:rPr>
       </w:r>
     </w:p>
@@ -10111,7 +10844,7 @@
       </w:r>
       <w:r>
         <w:rPr>
-          <w:rFonts w:ascii="Arial" w:hAnsi="Arial" w:eastAsia="Arial" w:cs="Arial"/>
+          <w:rFonts w:ascii="Arial" w:hAnsi="Arial" w:cs="Arial"/>
           <w:sz w:val="24"/>
           <w:szCs w:val="24"/>
         </w:rPr>
@@ -10179,6 +10912,11 @@
       <w:r>
         <w:rPr>
           <w:rFonts w:ascii="Arial" w:hAnsi="Arial" w:eastAsia="Arial" w:cs="Arial"/>
+        </w:rPr>
+      </w:r>
+      <w:r>
+        <w:rPr>
+          <w:rFonts w:ascii="Arial" w:hAnsi="Arial" w:cs="Arial"/>
         </w:rPr>
       </w:r>
     </w:p>
@@ -10240,6 +10978,11 @@
           <w:rFonts w:ascii="Arial" w:hAnsi="Arial" w:eastAsia="Arial" w:cs="Arial"/>
         </w:rPr>
       </w:r>
+      <w:r>
+        <w:rPr>
+          <w:rFonts w:ascii="Arial" w:hAnsi="Arial" w:cs="Arial"/>
+        </w:rPr>
+      </w:r>
     </w:p>
     <w:p>
       <w:pPr>
@@ -10297,12 +11040,11 @@
       <w:r>
         <w:rPr>
           <w:rFonts w:ascii="Arial" w:hAnsi="Arial" w:eastAsia="Arial" w:cs="Arial"/>
-          <w:sz w:val="24"/>
-        </w:rPr>
-      </w:r>
-      <w:r>
-        <w:rPr>
-          <w:rFonts w:ascii="Arial" w:hAnsi="Arial" w:eastAsia="Arial" w:cs="Arial"/>
+        </w:rPr>
+      </w:r>
+      <w:r>
+        <w:rPr>
+          <w:rFonts w:ascii="Arial" w:hAnsi="Arial" w:cs="Arial"/>
         </w:rPr>
       </w:r>
     </w:p>
@@ -10355,7 +11097,7 @@
                         <pic:nvPr/>
                       </pic:nvPicPr>
                       <pic:blipFill rotWithShape="1">
-                        <a:blip r:embed="rId27"/>
+                        <a:blip r:embed="rId30"/>
                         <a:stretch/>
                       </pic:blipFill>
                       <pic:spPr bwMode="auto">
@@ -10395,7 +11137,7 @@
                 <o:lock v:ext="edit" aspectratio="t"/>
               </v:shapetype>
               <v:shape id="_x0000_i26" o:spid="_x0000_s26" type="#_x0000_t75" style="width:382.73pt;height:339.40pt;mso-wrap-distance-left:0.00pt;mso-wrap-distance-top:0.00pt;mso-wrap-distance-right:0.00pt;mso-wrap-distance-bottom:0.00pt;z-index:1;" stroked="false">
-                <v:imagedata r:id="rId27" o:title=""/>
+                <v:imagedata r:id="rId30" o:title=""/>
                 <o:lock v:ext="edit" rotation="t"/>
               </v:shape>
             </w:pict>
@@ -10411,7 +11153,7 @@
       </w:r>
       <w:r>
         <w:rPr>
-          <w:rFonts w:ascii="Arial" w:hAnsi="Arial" w:eastAsia="Arial" w:cs="Arial"/>
+          <w:rFonts w:ascii="Arial" w:hAnsi="Arial" w:cs="Arial"/>
           <w:sz w:val="24"/>
           <w:szCs w:val="24"/>
         </w:rPr>
@@ -10449,12 +11191,11 @@
       <w:r>
         <w:rPr>
           <w:rFonts w:ascii="Arial" w:hAnsi="Arial" w:eastAsia="Arial" w:cs="Arial"/>
-          <w:lang w:val="es-ES"/>
-        </w:rPr>
-      </w:r>
-      <w:r>
-        <w:rPr>
-          <w:rFonts w:ascii="Arial" w:hAnsi="Arial" w:eastAsia="Arial" w:cs="Arial"/>
+        </w:rPr>
+      </w:r>
+      <w:r>
+        <w:rPr>
+          <w:rFonts w:ascii="Arial" w:hAnsi="Arial" w:cs="Arial"/>
         </w:rPr>
       </w:r>
     </w:p>
@@ -10539,6 +11280,11 @@
       <w:r>
         <w:rPr>
           <w:rFonts w:ascii="Arial" w:hAnsi="Arial" w:eastAsia="Arial" w:cs="Arial"/>
+        </w:rPr>
+      </w:r>
+      <w:r>
+        <w:rPr>
+          <w:rFonts w:ascii="Arial" w:hAnsi="Arial" w:cs="Arial"/>
         </w:rPr>
       </w:r>
     </w:p>
@@ -10600,6 +11346,11 @@
           <w:rFonts w:ascii="Arial" w:hAnsi="Arial" w:eastAsia="Arial" w:cs="Arial"/>
         </w:rPr>
       </w:r>
+      <w:r>
+        <w:rPr>
+          <w:rFonts w:ascii="Arial" w:hAnsi="Arial" w:cs="Arial"/>
+        </w:rPr>
+      </w:r>
     </w:p>
     <w:p>
       <w:pPr>
@@ -10657,6 +11408,11 @@
       <w:r>
         <w:rPr>
           <w:rFonts w:ascii="Arial" w:hAnsi="Arial" w:eastAsia="Arial" w:cs="Arial"/>
+        </w:rPr>
+      </w:r>
+      <w:r>
+        <w:rPr>
+          <w:rFonts w:ascii="Arial" w:hAnsi="Arial" w:cs="Arial"/>
         </w:rPr>
       </w:r>
     </w:p>
@@ -10695,7 +11451,7 @@
                         <pic:nvPr/>
                       </pic:nvPicPr>
                       <pic:blipFill rotWithShape="1">
-                        <a:blip r:embed="rId28"/>
+                        <a:blip r:embed="rId31"/>
                         <a:stretch/>
                       </pic:blipFill>
                       <pic:spPr bwMode="auto">
@@ -10735,7 +11491,7 @@
                 <o:lock v:ext="edit" aspectratio="t"/>
               </v:shapetype>
               <v:shape id="_x0000_i27" o:spid="_x0000_s27" type="#_x0000_t75" style="width:449.34pt;height:354.66pt;mso-wrap-distance-left:0.00pt;mso-wrap-distance-top:0.00pt;mso-wrap-distance-right:0.00pt;mso-wrap-distance-bottom:0.00pt;z-index:1;" stroked="false">
-                <v:imagedata r:id="rId28" o:title=""/>
+                <v:imagedata r:id="rId31" o:title=""/>
                 <o:lock v:ext="edit" rotation="t"/>
               </v:shape>
             </w:pict>
@@ -10747,6 +11503,11 @@
           <w:rFonts w:ascii="Arial" w:hAnsi="Arial" w:eastAsia="Arial" w:cs="Arial"/>
         </w:rPr>
       </w:r>
+      <w:r>
+        <w:rPr>
+          <w:rFonts w:ascii="Arial" w:hAnsi="Arial" w:cs="Arial"/>
+        </w:rPr>
+      </w:r>
     </w:p>
     <w:p>
       <w:pPr>
@@ -10774,6 +11535,11 @@
       <w:r>
         <w:rPr>
           <w:rFonts w:ascii="Arial" w:hAnsi="Arial" w:eastAsia="Arial" w:cs="Arial"/>
+        </w:rPr>
+      </w:r>
+      <w:r>
+        <w:rPr>
+          <w:rFonts w:ascii="Arial" w:hAnsi="Arial" w:cs="Arial"/>
         </w:rPr>
       </w:r>
     </w:p>

</xml_diff>